<commit_message>
docs: regenerate the PDF and Word of the requirements and the user and administrator manuals
</commit_message>
<xml_diff>
--- a/09_MANUALES/EN/WORD/09_Administrator_Manual.docx
+++ b/09_MANUALES/EN/WORD/09_Administrator_Manual.docx
@@ -407,6 +407,52 @@
           </w:p>
         </w:tc>
       </w:tr>
+      <w:tr>
+        <w:tc>
+          <w:tcPr/>
+          <w:p>
+            <w:pPr>
+              <w:pStyle w:val="Compact"/>
+            </w:pPr>
+            <w:r>
+              <w:t xml:space="preserve">4.2</w:t>
+            </w:r>
+          </w:p>
+        </w:tc>
+        <w:tc>
+          <w:tcPr/>
+          <w:p>
+            <w:pPr>
+              <w:pStyle w:val="Compact"/>
+            </w:pPr>
+            <w:r>
+              <w:t xml:space="preserve">2026-10-19</w:t>
+            </w:r>
+          </w:p>
+        </w:tc>
+        <w:tc>
+          <w:tcPr/>
+          <w:p>
+            <w:pPr>
+              <w:pStyle w:val="Compact"/>
+            </w:pPr>
+            <w:r>
+              <w:t xml:space="preserve">The user type is changed from Management &gt; Users (section 10.3); an administrator account cannot be deactivated (section 9.4).</w:t>
+            </w:r>
+          </w:p>
+        </w:tc>
+        <w:tc>
+          <w:tcPr/>
+          <w:p>
+            <w:pPr>
+              <w:pStyle w:val="Compact"/>
+            </w:pPr>
+            <w:r>
+              <w:t xml:space="preserve">Development team</w:t>
+            </w:r>
+          </w:p>
+        </w:tc>
+      </w:tr>
     </w:tbl>
     <w:p>
       <w:pPr>
@@ -3478,18 +3524,18 @@
               <w:pStyle w:val="Compact"/>
             </w:pPr>
             <w:r>
-              <w:t xml:space="preserve">Creates accounts and activates or deactivates them.</w:t>
-            </w:r>
-          </w:p>
-        </w:tc>
-        <w:tc>
-          <w:tcPr/>
-          <w:p>
-            <w:pPr>
-              <w:pStyle w:val="Compact"/>
-            </w:pPr>
-            <w:r>
-              <w:t xml:space="preserve">Accounts are deactivated, not deleted; the administrator cannot deactivate their own account.</w:t>
+              <w:t xml:space="preserve">Creates accounts, changes their user type, and activates or deactivates them.</w:t>
+            </w:r>
+          </w:p>
+        </w:tc>
+        <w:tc>
+          <w:tcPr/>
+          <w:p>
+            <w:pPr>
+              <w:pStyle w:val="Compact"/>
+            </w:pPr>
+            <w:r>
+              <w:t xml:space="preserve">Accounts are deactivated, not deleted; an administrator account is not deactivated and nobody changes their own user type.</w:t>
             </w:r>
           </w:p>
         </w:tc>
@@ -4526,7 +4572,23 @@
         <w:pStyle w:val="BodyText"/>
       </w:pPr>
       <w:r>
-        <w:t xml:space="preserve">To turn an existing account into an administrator (for example, one registered from the public screen), the role can be assigned with SQL, because the password was already generated by the application:</w:t>
+        <w:t xml:space="preserve">To turn an existing account into an administrator (for example, one registered from the public screen), another administrator changes its user type in</w:t>
+      </w:r>
+      <w:r>
+        <w:t xml:space="preserve"> </w:t>
+      </w:r>
+      <w:r>
+        <w:rPr>
+          <w:b/>
+          <w:bCs/>
+        </w:rPr>
+        <w:t xml:space="preserve">Management &gt; Users</w:t>
+      </w:r>
+      <w:r>
+        <w:t xml:space="preserve"> </w:t>
+      </w:r>
+      <w:r>
+        <w:t xml:space="preserve">(section 10.3). Only when there is still no administrator with access is the role assigned with SQL, because the password was already generated by the application:</w:t>
       </w:r>
     </w:p>
     <w:p>
@@ -5712,7 +5774,20 @@
         <w:pStyle w:val="FirstParagraph"/>
       </w:pPr>
       <w:r>
-        <w:t xml:space="preserve">The system does not allow an administrator to deactivate their own account ("You cannot disable your own account"). Before deactivating an administrator, verify that at least one other active administrator remains.</w:t>
+        <w:t xml:space="preserve">An administrator account cannot be deactivated: the button appears blocked with the message "An administrator account cannot be disabled. Change its user type first." To remove an administrator, first change their user type (section 10.3) and then deactivate the account. Nobody can deactivate their own account either, from this table or from</w:t>
+      </w:r>
+      <w:r>
+        <w:t xml:space="preserve"> </w:t>
+      </w:r>
+      <w:r>
+        <w:rPr>
+          <w:b/>
+          <w:bCs/>
+        </w:rPr>
+        <w:t xml:space="preserve">Profile</w:t>
+      </w:r>
+      <w:r>
+        <w:t xml:space="preserve">.</w:t>
       </w:r>
     </w:p>
     <w:bookmarkEnd w:id="56"/>
@@ -6896,7 +6971,7 @@
         <w:pStyle w:val="FirstParagraph"/>
       </w:pPr>
       <w:r>
-        <w:t xml:space="preserve">The panel does not offer an option to change the role of an existing account. When it is necessary, the IT administrator follows this procedure:</w:t>
+        <w:t xml:space="preserve">Each account has one user type (Client, Operator, or Administrator), and the new one replaces the previous one.</w:t>
       </w:r>
     </w:p>
     <w:p>
@@ -6908,7 +6983,20 @@
         </w:numPr>
       </w:pPr>
       <w:r>
-        <w:t xml:space="preserve">Record the request: who asks for it, who approves it, the current role, the new role, and the reason.</w:t>
+        <w:t xml:space="preserve">In</w:t>
+      </w:r>
+      <w:r>
+        <w:t xml:space="preserve"> </w:t>
+      </w:r>
+      <w:r>
+        <w:rPr>
+          <w:b/>
+          <w:bCs/>
+        </w:rPr>
+        <w:t xml:space="preserve">Management &gt; Users</w:t>
+      </w:r>
+      <w:r>
+        <w:t xml:space="preserve">, locate the account.</w:t>
       </w:r>
     </w:p>
     <w:p>
@@ -6920,7 +7008,39 @@
         </w:numPr>
       </w:pPr>
       <w:r>
-        <w:t xml:space="preserve">Verify the identity of the person.</w:t>
+        <w:t xml:space="preserve">In the</w:t>
+      </w:r>
+      <w:r>
+        <w:t xml:space="preserve"> </w:t>
+      </w:r>
+      <w:r>
+        <w:rPr>
+          <w:b/>
+          <w:bCs/>
+        </w:rPr>
+        <w:t xml:space="preserve">User type</w:t>
+      </w:r>
+      <w:r>
+        <w:t xml:space="preserve"> </w:t>
+      </w:r>
+      <w:r>
+        <w:t xml:space="preserve">column, choose the new type in the</w:t>
+      </w:r>
+      <w:r>
+        <w:t xml:space="preserve"> </w:t>
+      </w:r>
+      <w:r>
+        <w:rPr>
+          <w:b/>
+          <w:bCs/>
+        </w:rPr>
+        <w:t xml:space="preserve">Change user type</w:t>
+      </w:r>
+      <w:r>
+        <w:t xml:space="preserve"> </w:t>
+      </w:r>
+      <w:r>
+        <w:t xml:space="preserve">list.</w:t>
       </w:r>
     </w:p>
     <w:p>
@@ -6932,20 +7052,7 @@
         </w:numPr>
       </w:pPr>
       <w:r>
-        <w:t xml:space="preserve">Modify the assignment in</w:t>
-      </w:r>
-      <w:r>
-        <w:t xml:space="preserve"> </w:t>
-      </w:r>
-      <w:r>
-        <w:rPr>
-          <w:i/>
-          <w:iCs/>
-        </w:rPr>
-        <w:t xml:space="preserve">security.user_role</w:t>
-      </w:r>
-      <w:r>
-        <w:t xml:space="preserve">; remove the previous role if it must not remain.</w:t>
+        <w:t xml:space="preserve">Confirm the message "Change the user type?", which warns that the person's open sessions will be closed.</w:t>
       </w:r>
     </w:p>
     <w:p>
@@ -6957,7 +7064,7 @@
         </w:numPr>
       </w:pPr>
       <w:r>
-        <w:t xml:space="preserve">If the new role is OPERATOR, the operations service creates the operator record automatically the next time the operators are listed.</w:t>
+        <w:t xml:space="preserve">Ask the person to sign in again: they will enter the panel of their new role.</w:t>
       </w:r>
     </w:p>
     <w:p>
@@ -6969,19 +7076,31 @@
         </w:numPr>
       </w:pPr>
       <w:r>
-        <w:t xml:space="preserve">Ask the person to log out and log in again, so that the new token reflects the role.</w:t>
-      </w:r>
-    </w:p>
-    <w:p>
-      <w:pPr>
-        <w:pStyle w:val="Compact"/>
-        <w:numPr>
-          <w:ilvl w:val="0"/>
-          <w:numId w:val="1028"/>
-        </w:numPr>
-      </w:pPr>
-      <w:r>
-        <w:t xml:space="preserve">File the request together with the date and the author of the change.</w:t>
+        <w:t xml:space="preserve">If the new type is Operator, the operations service creates their operator record the next time the operators are listed; give them shifts in</w:t>
+      </w:r>
+      <w:r>
+        <w:t xml:space="preserve"> </w:t>
+      </w:r>
+      <w:r>
+        <w:rPr>
+          <w:b/>
+          <w:bCs/>
+        </w:rPr>
+        <w:t xml:space="preserve">Operators</w:t>
+      </w:r>
+      <w:r>
+        <w:t xml:space="preserve"> </w:t>
+      </w:r>
+      <w:r>
+        <w:t xml:space="preserve">(section 12).</w:t>
+      </w:r>
+    </w:p>
+    <w:p>
+      <w:pPr>
+        <w:pStyle w:val="FirstParagraph"/>
+      </w:pPr>
+      <w:r>
+        <w:t xml:space="preserve">Your own account does not show the list but the user type as a label ("You cannot change the user type of your own account"). It is recommended to record who asked for the change and why in the team's log.</w:t>
       </w:r>
     </w:p>
     <w:bookmarkEnd w:id="62"/>
@@ -23643,7 +23762,7 @@
       <w:color w:themeColor="accent1" w:themeShade="BF" w:val="365F91"/>
     </w:rPr>
   </w:style>
-  <w:style w:type="paragraph" w:customStyle="1" w:styleId="SourceCode">
+  <w:style w:customStyle="1" w:styleId="SourceCode" w:type="paragraph">
     <w:name w:val="Source Code"/>
     <w:basedOn w:val="Normal"/>
     <w:link w:val="VerbatimChar"/>
@@ -23651,7 +23770,7 @@
       <w:wordWrap w:val="off"/>
     </w:pPr>
   </w:style>
-  <w:style w:type="character" w:customStyle="1" w:styleId="KeywordTok">
+  <w:style w:customStyle="1" w:styleId="KeywordTok" w:type="character">
     <w:name w:val="KeywordTok"/>
     <w:basedOn w:val="VerbatimChar"/>
     <w:rPr>
@@ -23659,77 +23778,77 @@
       <w:color w:val="007020"/>
     </w:rPr>
   </w:style>
-  <w:style w:type="character" w:customStyle="1" w:styleId="DataTypeTok">
+  <w:style w:customStyle="1" w:styleId="DataTypeTok" w:type="character">
     <w:name w:val="DataTypeTok"/>
     <w:basedOn w:val="VerbatimChar"/>
     <w:rPr>
       <w:color w:val="902000"/>
     </w:rPr>
   </w:style>
-  <w:style w:type="character" w:customStyle="1" w:styleId="DecValTok">
+  <w:style w:customStyle="1" w:styleId="DecValTok" w:type="character">
     <w:name w:val="DecValTok"/>
     <w:basedOn w:val="VerbatimChar"/>
     <w:rPr>
       <w:color w:val="40a070"/>
     </w:rPr>
   </w:style>
-  <w:style w:type="character" w:customStyle="1" w:styleId="BaseNTok">
+  <w:style w:customStyle="1" w:styleId="BaseNTok" w:type="character">
     <w:name w:val="BaseNTok"/>
     <w:basedOn w:val="VerbatimChar"/>
     <w:rPr>
       <w:color w:val="40a070"/>
     </w:rPr>
   </w:style>
-  <w:style w:type="character" w:customStyle="1" w:styleId="FloatTok">
+  <w:style w:customStyle="1" w:styleId="FloatTok" w:type="character">
     <w:name w:val="FloatTok"/>
     <w:basedOn w:val="VerbatimChar"/>
     <w:rPr>
       <w:color w:val="40a070"/>
     </w:rPr>
   </w:style>
-  <w:style w:type="character" w:customStyle="1" w:styleId="ConstantTok">
+  <w:style w:customStyle="1" w:styleId="ConstantTok" w:type="character">
     <w:name w:val="ConstantTok"/>
     <w:basedOn w:val="VerbatimChar"/>
     <w:rPr>
       <w:color w:val="880000"/>
     </w:rPr>
   </w:style>
-  <w:style w:type="character" w:customStyle="1" w:styleId="CharTok">
+  <w:style w:customStyle="1" w:styleId="CharTok" w:type="character">
     <w:name w:val="CharTok"/>
     <w:basedOn w:val="VerbatimChar"/>
     <w:rPr>
       <w:color w:val="4070a0"/>
     </w:rPr>
   </w:style>
-  <w:style w:type="character" w:customStyle="1" w:styleId="SpecialCharTok">
+  <w:style w:customStyle="1" w:styleId="SpecialCharTok" w:type="character">
     <w:name w:val="SpecialCharTok"/>
     <w:basedOn w:val="VerbatimChar"/>
     <w:rPr>
       <w:color w:val="4070a0"/>
     </w:rPr>
   </w:style>
-  <w:style w:type="character" w:customStyle="1" w:styleId="StringTok">
+  <w:style w:customStyle="1" w:styleId="StringTok" w:type="character">
     <w:name w:val="StringTok"/>
     <w:basedOn w:val="VerbatimChar"/>
     <w:rPr>
       <w:color w:val="4070a0"/>
     </w:rPr>
   </w:style>
-  <w:style w:type="character" w:customStyle="1" w:styleId="VerbatimStringTok">
+  <w:style w:customStyle="1" w:styleId="VerbatimStringTok" w:type="character">
     <w:name w:val="VerbatimStringTok"/>
     <w:basedOn w:val="VerbatimChar"/>
     <w:rPr>
       <w:color w:val="4070a0"/>
     </w:rPr>
   </w:style>
-  <w:style w:type="character" w:customStyle="1" w:styleId="SpecialStringTok">
+  <w:style w:customStyle="1" w:styleId="SpecialStringTok" w:type="character">
     <w:name w:val="SpecialStringTok"/>
     <w:basedOn w:val="VerbatimChar"/>
     <w:rPr>
       <w:color w:val="bb6688"/>
     </w:rPr>
   </w:style>
-  <w:style w:type="character" w:customStyle="1" w:styleId="ImportTok">
+  <w:style w:customStyle="1" w:styleId="ImportTok" w:type="character">
     <w:name w:val="ImportTok"/>
     <w:basedOn w:val="VerbatimChar"/>
     <w:rPr>
@@ -23737,7 +23856,7 @@
       <w:color w:val="008000"/>
     </w:rPr>
   </w:style>
-  <w:style w:type="character" w:customStyle="1" w:styleId="CommentTok">
+  <w:style w:customStyle="1" w:styleId="CommentTok" w:type="character">
     <w:name w:val="CommentTok"/>
     <w:basedOn w:val="VerbatimChar"/>
     <w:rPr>
@@ -23745,7 +23864,7 @@
       <w:color w:val="60a0b0"/>
     </w:rPr>
   </w:style>
-  <w:style w:type="character" w:customStyle="1" w:styleId="DocumentationTok">
+  <w:style w:customStyle="1" w:styleId="DocumentationTok" w:type="character">
     <w:name w:val="DocumentationTok"/>
     <w:basedOn w:val="VerbatimChar"/>
     <w:rPr>
@@ -23753,7 +23872,7 @@
       <w:color w:val="ba2121"/>
     </w:rPr>
   </w:style>
-  <w:style w:type="character" w:customStyle="1" w:styleId="AnnotationTok">
+  <w:style w:customStyle="1" w:styleId="AnnotationTok" w:type="character">
     <w:name w:val="AnnotationTok"/>
     <w:basedOn w:val="VerbatimChar"/>
     <w:rPr>
@@ -23762,7 +23881,7 @@
       <w:color w:val="60a0b0"/>
     </w:rPr>
   </w:style>
-  <w:style w:type="character" w:customStyle="1" w:styleId="CommentVarTok">
+  <w:style w:customStyle="1" w:styleId="CommentVarTok" w:type="character">
     <w:name w:val="CommentVarTok"/>
     <w:basedOn w:val="VerbatimChar"/>
     <w:rPr>
@@ -23771,28 +23890,28 @@
       <w:color w:val="60a0b0"/>
     </w:rPr>
   </w:style>
-  <w:style w:type="character" w:customStyle="1" w:styleId="OtherTok">
+  <w:style w:customStyle="1" w:styleId="OtherTok" w:type="character">
     <w:name w:val="OtherTok"/>
     <w:basedOn w:val="VerbatimChar"/>
     <w:rPr>
       <w:color w:val="007020"/>
     </w:rPr>
   </w:style>
-  <w:style w:type="character" w:customStyle="1" w:styleId="FunctionTok">
+  <w:style w:customStyle="1" w:styleId="FunctionTok" w:type="character">
     <w:name w:val="FunctionTok"/>
     <w:basedOn w:val="VerbatimChar"/>
     <w:rPr>
       <w:color w:val="06287e"/>
     </w:rPr>
   </w:style>
-  <w:style w:type="character" w:customStyle="1" w:styleId="VariableTok">
+  <w:style w:customStyle="1" w:styleId="VariableTok" w:type="character">
     <w:name w:val="VariableTok"/>
     <w:basedOn w:val="VerbatimChar"/>
     <w:rPr>
       <w:color w:val="19177c"/>
     </w:rPr>
   </w:style>
-  <w:style w:type="character" w:customStyle="1" w:styleId="ControlFlowTok">
+  <w:style w:customStyle="1" w:styleId="ControlFlowTok" w:type="character">
     <w:name w:val="ControlFlowTok"/>
     <w:basedOn w:val="VerbatimChar"/>
     <w:rPr>
@@ -23800,45 +23919,45 @@
       <w:color w:val="007020"/>
     </w:rPr>
   </w:style>
-  <w:style w:type="character" w:customStyle="1" w:styleId="OperatorTok">
+  <w:style w:customStyle="1" w:styleId="OperatorTok" w:type="character">
     <w:name w:val="OperatorTok"/>
     <w:basedOn w:val="VerbatimChar"/>
     <w:rPr>
       <w:color w:val="666666"/>
     </w:rPr>
   </w:style>
-  <w:style w:type="character" w:customStyle="1" w:styleId="BuiltInTok">
+  <w:style w:customStyle="1" w:styleId="BuiltInTok" w:type="character">
     <w:name w:val="BuiltInTok"/>
     <w:basedOn w:val="VerbatimChar"/>
     <w:rPr>
       <w:color w:val="008000"/>
     </w:rPr>
   </w:style>
-  <w:style w:type="character" w:customStyle="1" w:styleId="ExtensionTok">
+  <w:style w:customStyle="1" w:styleId="ExtensionTok" w:type="character">
     <w:name w:val="ExtensionTok"/>
     <w:basedOn w:val="VerbatimChar"/>
     <w:rPr/>
   </w:style>
-  <w:style w:type="character" w:customStyle="1" w:styleId="PreprocessorTok">
+  <w:style w:customStyle="1" w:styleId="PreprocessorTok" w:type="character">
     <w:name w:val="PreprocessorTok"/>
     <w:basedOn w:val="VerbatimChar"/>
     <w:rPr>
       <w:color w:val="bc7a00"/>
     </w:rPr>
   </w:style>
-  <w:style w:type="character" w:customStyle="1" w:styleId="AttributeTok">
+  <w:style w:customStyle="1" w:styleId="AttributeTok" w:type="character">
     <w:name w:val="AttributeTok"/>
     <w:basedOn w:val="VerbatimChar"/>
     <w:rPr>
       <w:color w:val="7d9029"/>
     </w:rPr>
   </w:style>
-  <w:style w:type="character" w:customStyle="1" w:styleId="RegionMarkerTok">
+  <w:style w:customStyle="1" w:styleId="RegionMarkerTok" w:type="character">
     <w:name w:val="RegionMarkerTok"/>
     <w:basedOn w:val="VerbatimChar"/>
     <w:rPr/>
   </w:style>
-  <w:style w:type="character" w:customStyle="1" w:styleId="InformationTok">
+  <w:style w:customStyle="1" w:styleId="InformationTok" w:type="character">
     <w:name w:val="InformationTok"/>
     <w:basedOn w:val="VerbatimChar"/>
     <w:rPr>
@@ -23847,7 +23966,7 @@
       <w:color w:val="60a0b0"/>
     </w:rPr>
   </w:style>
-  <w:style w:type="character" w:customStyle="1" w:styleId="WarningTok">
+  <w:style w:customStyle="1" w:styleId="WarningTok" w:type="character">
     <w:name w:val="WarningTok"/>
     <w:basedOn w:val="VerbatimChar"/>
     <w:rPr>
@@ -23856,7 +23975,7 @@
       <w:color w:val="60a0b0"/>
     </w:rPr>
   </w:style>
-  <w:style w:type="character" w:customStyle="1" w:styleId="AlertTok">
+  <w:style w:customStyle="1" w:styleId="AlertTok" w:type="character">
     <w:name w:val="AlertTok"/>
     <w:basedOn w:val="VerbatimChar"/>
     <w:rPr>
@@ -23864,7 +23983,7 @@
       <w:color w:val="ff0000"/>
     </w:rPr>
   </w:style>
-  <w:style w:type="character" w:customStyle="1" w:styleId="ErrorTok">
+  <w:style w:customStyle="1" w:styleId="ErrorTok" w:type="character">
     <w:name w:val="ErrorTok"/>
     <w:basedOn w:val="VerbatimChar"/>
     <w:rPr>
@@ -23872,7 +23991,7 @@
       <w:color w:val="ff0000"/>
     </w:rPr>
   </w:style>
-  <w:style w:type="character" w:customStyle="1" w:styleId="NormalTok">
+  <w:style w:customStyle="1" w:styleId="NormalTok" w:type="character">
     <w:name w:val="NormalTok"/>
     <w:basedOn w:val="VerbatimChar"/>
     <w:rPr/>

</xml_diff>

<commit_message>
docs(manuals): regenerate the PDF and Word of the administrator manual
</commit_message>
<xml_diff>
--- a/09_MANUALES/EN/WORD/09_Administrator_Manual.docx
+++ b/09_MANUALES/EN/WORD/09_Administrator_Manual.docx
@@ -7452,7 +7452,23 @@
         <w:pStyle w:val="FirstParagraph"/>
       </w:pPr>
       <w:r>
-        <w:t xml:space="preserve">The legal name, the tax ID, and the address are required; the phone must have at least 7 digits, the email must be valid, and the founding date cannot be in the future.</w:t>
+        <w:t xml:space="preserve">The legal name, the tax ID, and the address are required; the phone must have at least 7 digits, the email must be valid, and the founding date cannot be in the future. In the mobile app,</w:t>
+      </w:r>
+      <w:r>
+        <w:t xml:space="preserve"> </w:t>
+      </w:r>
+      <w:r>
+        <w:rPr>
+          <w:b/>
+          <w:bCs/>
+        </w:rPr>
+        <w:t xml:space="preserve">More &gt; Settings &gt; Business data</w:t>
+      </w:r>
+      <w:r>
+        <w:t xml:space="preserve"> </w:t>
+      </w:r>
+      <w:r>
+        <w:t xml:space="preserve">shows the same cards with their pencil and saves to the same place.</w:t>
       </w:r>
     </w:p>
     <w:p>

</xml_diff>

<commit_message>
docs(manuals): add the to-close card and the corrected expired bookings rule to the English administrator manual (4.6)
</commit_message>
<xml_diff>
--- a/09_MANUALES/EN/WORD/09_Administrator_Manual.docx
+++ b/09_MANUALES/EN/WORD/09_Administrator_Manual.docx
@@ -2,7 +2,7 @@
 <file path=word/document.xml><?xml version="1.0" encoding="utf-8"?>
 <w:document xmlns:w="http://schemas.openxmlformats.org/wordprocessingml/2006/main" xmlns:m="http://schemas.openxmlformats.org/officeDocument/2006/math" xmlns:r="http://schemas.openxmlformats.org/officeDocument/2006/relationships" xmlns:o="urn:schemas-microsoft-com:office:office" xmlns:v="urn:schemas-microsoft-com:vml" xmlns:w10="urn:schemas-microsoft-com:office:word" xmlns:a="http://schemas.openxmlformats.org/drawingml/2006/main" xmlns:pic="http://schemas.openxmlformats.org/drawingml/2006/picture" xmlns:wp="http://schemas.openxmlformats.org/drawingml/2006/wordprocessingDrawing">
   <w:body>
-    <w:bookmarkStart w:id="156" w:name="administrator-manual"/>
+    <w:bookmarkStart w:id="157" w:name="administrator-manual"/>
     <w:p>
       <w:pPr>
         <w:pStyle w:val="Heading1"/>
@@ -64,7 +64,7 @@
         <w:pStyle w:val="BodyText"/>
       </w:pPr>
       <w:r>
-        <w:t xml:space="preserve">October 17, 2026</w:t>
+        <w:t xml:space="preserve">October 21, 2026</w:t>
       </w:r>
     </w:p>
     <w:p>
@@ -72,7 +72,7 @@
         <w:pStyle w:val="BodyText"/>
       </w:pPr>
       <w:r>
-        <w:t xml:space="preserve">Manual Type: Administrator Manual (Business Administrators and IT Administrators) · Version 4.1</w:t>
+        <w:t xml:space="preserve">Manual Type: Administrator Manual (Business Administrators and IT Administrators) · Version 4.6</w:t>
       </w:r>
     </w:p>
     <w:bookmarkStart w:id="20" w:name="version-control"/>
@@ -545,6 +545,162 @@
           </w:p>
         </w:tc>
       </w:tr>
+      <w:tr>
+        <w:tc>
+          <w:tcPr/>
+          <w:p>
+            <w:pPr>
+              <w:pStyle w:val="Compact"/>
+            </w:pPr>
+            <w:r>
+              <w:t xml:space="preserve">4.5</w:t>
+            </w:r>
+          </w:p>
+        </w:tc>
+        <w:tc>
+          <w:tcPr/>
+          <w:p>
+            <w:pPr>
+              <w:pStyle w:val="Compact"/>
+            </w:pPr>
+            <w:r>
+              <w:t xml:space="preserve">2026-10-21</w:t>
+            </w:r>
+          </w:p>
+        </w:tc>
+        <w:tc>
+          <w:tcPr/>
+          <w:p>
+            <w:pPr>
+              <w:pStyle w:val="Compact"/>
+            </w:pPr>
+            <w:r>
+              <w:t xml:space="preserve">Review against the code and the server of October 21, 2026: deactivating an account makes its session stop working (sections 9.4, 9.6, and 17.5); the roles tab says that the role decides the access (section 10.1); the cash account and its option for the customer (section 11.4); bookings that close on their own, single count of bookings without an operator, and the assignment lock (sections 12.3 and 12.4); receipt of at most 2 MB (section 12.6); reports with only completed bookings (section 13); automatic backups of the public server (sections 14.6 and 15.2) and security headers (section 17.4). The date and the version of the cover and the row of data that used to be stored only in the browser (Table 12) were corrected.</w:t>
+            </w:r>
+          </w:p>
+        </w:tc>
+        <w:tc>
+          <w:tcPr/>
+          <w:p>
+            <w:pPr>
+              <w:pStyle w:val="Compact"/>
+            </w:pPr>
+            <w:r>
+              <w:t xml:space="preserve">Development team</w:t>
+            </w:r>
+          </w:p>
+        </w:tc>
+      </w:tr>
+      <w:tr>
+        <w:tc>
+          <w:tcPr/>
+          <w:p>
+            <w:pPr>
+              <w:pStyle w:val="Compact"/>
+            </w:pPr>
+            <w:r>
+              <w:t xml:space="preserve">4.6</w:t>
+            </w:r>
+          </w:p>
+        </w:tc>
+        <w:tc>
+          <w:tcPr/>
+          <w:p>
+            <w:pPr>
+              <w:pStyle w:val="Compact"/>
+            </w:pPr>
+            <w:r>
+              <w:t xml:space="preserve">2026-10-21</w:t>
+            </w:r>
+          </w:p>
+        </w:tc>
+        <w:tc>
+          <w:tcPr/>
+          <w:p>
+            <w:pPr>
+              <w:pStyle w:val="Compact"/>
+            </w:pPr>
+            <w:r>
+              <w:t xml:space="preserve">Change of the rule for bookings that end without being closed, reviewed by the team on the night of October 21: only a confirmed booking that never had an operator becomes No-show on its own; one that had an operator and nobody recorded goes to the</w:t>
+            </w:r>
+            <w:r>
+              <w:t xml:space="preserve"> </w:t>
+            </w:r>
+            <w:r>
+              <w:rPr>
+                <w:b/>
+                <w:bCs/>
+              </w:rPr>
+              <w:t xml:space="preserve">To close</w:t>
+            </w:r>
+            <w:r>
+              <w:t xml:space="preserve"> </w:t>
+            </w:r>
+            <w:r>
+              <w:t xml:space="preserve">card of the home screen (web and mobile app), where the administrator chooses</w:t>
+            </w:r>
+            <w:r>
+              <w:t xml:space="preserve"> </w:t>
+            </w:r>
+            <w:r>
+              <w:rPr>
+                <w:b/>
+                <w:bCs/>
+              </w:rPr>
+              <w:t xml:space="preserve">Attended</w:t>
+            </w:r>
+            <w:r>
+              <w:t xml:space="preserve"> </w:t>
+            </w:r>
+            <w:r>
+              <w:t xml:space="preserve">or</w:t>
+            </w:r>
+            <w:r>
+              <w:t xml:space="preserve"> </w:t>
+            </w:r>
+            <w:r>
+              <w:rPr>
+                <w:b/>
+                <w:bCs/>
+              </w:rPr>
+              <w:t xml:space="preserve">No-show</w:t>
+            </w:r>
+            <w:r>
+              <w:t xml:space="preserve"> </w:t>
+            </w:r>
+            <w:r>
+              <w:t xml:space="preserve">(sections 6.3, 8.3, 12.3, and 12.7). Bookings without an operator with a single rule in the mobile app too (sections 8.3 and 12.4);</w:t>
+            </w:r>
+            <w:r>
+              <w:t xml:space="preserve"> </w:t>
+            </w:r>
+            <w:r>
+              <w:rPr>
+                <w:i/>
+                <w:iCs/>
+              </w:rPr>
+              <w:t xml:space="preserve">FOLLOW_UP_*</w:t>
+            </w:r>
+            <w:r>
+              <w:t xml:space="preserve"> </w:t>
+            </w:r>
+            <w:r>
+              <w:t xml:space="preserve">variables (section 11.6); new incident and glossary term (Tables 18 and 20).</w:t>
+            </w:r>
+          </w:p>
+        </w:tc>
+        <w:tc>
+          <w:tcPr/>
+          <w:p>
+            <w:pPr>
+              <w:pStyle w:val="Compact"/>
+            </w:pPr>
+            <w:r>
+              <w:t xml:space="preserve">Development team</w:t>
+            </w:r>
+          </w:p>
+        </w:tc>
+      </w:tr>
     </w:tbl>
     <w:p>
       <w:pPr>
@@ -1513,6 +1669,23 @@
       <w:pPr>
         <w:pStyle w:val="Compact"/>
         <w:numPr>
+          <w:ilvl w:val="1"/>
+          <w:numId w:val="1012"/>
+        </w:numPr>
+      </w:pPr>
+      <w:hyperlink w:anchor="Xc924d9342ec3f3874b9ca7467a676209c1c748e">
+        <w:r>
+          <w:rPr>
+            <w:rStyle w:val="Hyperlink"/>
+          </w:rPr>
+          <w:t xml:space="preserve">14.6 Automatic Backups of the Public Server</w:t>
+        </w:r>
+      </w:hyperlink>
+    </w:p>
+    <w:p>
+      <w:pPr>
+        <w:pStyle w:val="Compact"/>
+        <w:numPr>
           <w:ilvl w:val="0"/>
           <w:numId w:val="1001"/>
         </w:numPr>
@@ -1974,7 +2147,7 @@
         <w:pStyle w:val="FirstParagraph"/>
       </w:pPr>
       <w:r>
-        <w:t xml:space="preserve">The manual was verified against the source code of the web application and of the services (Vehicle Washing Development Team, 2026b, 2026c, 2026d) and against the project documentation updated on October 17, 2026 (Vehicle Washing Development Team, 2026a). The web application includes a complete administration module under the route</w:t>
+        <w:t xml:space="preserve">The manual was verified against the source code of the web application and of the services (Vehicle Washing Development Team, 2026b, 2026c, 2026d) and against the project documentation updated on October 21, 2026 (Vehicle Washing Development Team, 2026a). The web application includes a complete administration module under the route</w:t>
       </w:r>
       <w:r>
         <w:t xml:space="preserve"> </w:t>
@@ -2266,7 +2439,7 @@
         <w:pStyle w:val="FirstParagraph"/>
       </w:pPr>
       <w:r>
-        <w:t xml:space="preserve">Table 2 summarizes the real status of each function in the version of October 16, 2026, reviewed against the code and with the system running.</w:t>
+        <w:t xml:space="preserve">Table 2 summarizes the real status of each function in the version of October 21, 2026, reviewed against the code and with the system running.</w:t>
       </w:r>
     </w:p>
     <w:p>
@@ -2476,7 +2649,7 @@
               <w:pStyle w:val="Compact"/>
             </w:pPr>
             <w:r>
-              <w:t xml:space="preserve">Complete for the permission matrix: the three fixed roles are applied by the server, and the permissions checked for each role are saved on the server (ADR-015). The matrix is informative: it does not yet change what each role can do.</w:t>
+              <w:t xml:space="preserve">Complete for the permission matrix: the three fixed roles are applied by the server, and the permissions checked for each role are saved on the server (ADR-015). The matrix is informative: it does not yet change what each role can do, and since October 21, 2026 the tab says so.</w:t>
             </w:r>
           </w:p>
         </w:tc>
@@ -2799,6 +2972,81 @@
             </w:pPr>
             <w:r>
               <w:t xml:space="preserve">Complete.</w:t>
+            </w:r>
+          </w:p>
+        </w:tc>
+        <w:tc>
+          <w:tcPr/>
+          <w:p>
+            <w:pPr>
+              <w:pStyle w:val="Compact"/>
+            </w:pPr>
+            <w:r>
+              <w:t xml:space="preserve">12.3</w:t>
+            </w:r>
+          </w:p>
+        </w:tc>
+      </w:tr>
+      <w:tr>
+        <w:tc>
+          <w:tcPr/>
+          <w:p>
+            <w:pPr>
+              <w:pStyle w:val="Compact"/>
+            </w:pPr>
+            <w:r>
+              <w:t xml:space="preserve">Bookings to close (services that ended without being recorded)</w:t>
+            </w:r>
+          </w:p>
+        </w:tc>
+        <w:tc>
+          <w:tcPr/>
+          <w:p>
+            <w:pPr>
+              <w:pStyle w:val="Compact"/>
+            </w:pPr>
+            <w:r>
+              <w:t xml:space="preserve">Dashboard (web and mobile app)</w:t>
+            </w:r>
+          </w:p>
+        </w:tc>
+        <w:tc>
+          <w:tcPr/>
+          <w:p>
+            <w:pPr>
+              <w:pStyle w:val="Compact"/>
+            </w:pPr>
+            <w:r>
+              <w:t xml:space="preserve">Complete since October 21, 2026:</w:t>
+            </w:r>
+            <w:r>
+              <w:t xml:space="preserve"> </w:t>
+            </w:r>
+            <w:r>
+              <w:rPr>
+                <w:b/>
+                <w:bCs/>
+              </w:rPr>
+              <w:t xml:space="preserve">Attended</w:t>
+            </w:r>
+            <w:r>
+              <w:t xml:space="preserve"> </w:t>
+            </w:r>
+            <w:r>
+              <w:t xml:space="preserve">or</w:t>
+            </w:r>
+            <w:r>
+              <w:t xml:space="preserve"> </w:t>
+            </w:r>
+            <w:r>
+              <w:rPr>
+                <w:b/>
+                <w:bCs/>
+              </w:rPr>
+              <w:t xml:space="preserve">No-show</w:t>
+            </w:r>
+            <w:r>
+              <w:t xml:space="preserve">.</w:t>
             </w:r>
           </w:p>
         </w:tc>
@@ -2992,7 +3240,7 @@
               <w:pStyle w:val="Compact"/>
             </w:pPr>
             <w:r>
-              <w:t xml:space="preserve">Complete (calculated in the browser from bookings and payments).</w:t>
+              <w:t xml:space="preserve">Complete (calculated in the browser from bookings and payments; only completed bookings count).</w:t>
             </w:r>
           </w:p>
         </w:tc>
@@ -3130,7 +3378,7 @@
               <w:pStyle w:val="Compact"/>
             </w:pPr>
             <w:r>
-              <w:t xml:space="preserve">Not application functions: they are performed on the database and the infrastructure.</w:t>
+              <w:t xml:space="preserve">Not application functions: they are performed on the database and the infrastructure. On the public server backups are automatic since October 21, 2026.</w:t>
             </w:r>
           </w:p>
         </w:tc>
@@ -4407,7 +4655,7 @@
               <w:pStyle w:val="Compact"/>
             </w:pPr>
             <w:r>
-              <w:t xml:space="preserve">Confirmed bookings waiting for a technician.</w:t>
+              <w:t xml:space="preserve">Scheduled or confirmed bookings waiting for a technician whose time has not ended; since October 21, 2026 it is the same count as the Bookings screen, on the web and in the mobile app.</w:t>
             </w:r>
           </w:p>
         </w:tc>
@@ -4429,6 +4677,67 @@
             </w:r>
             <w:r>
               <w:t xml:space="preserve">(section 12.4).</w:t>
+            </w:r>
+          </w:p>
+        </w:tc>
+      </w:tr>
+      <w:tr>
+        <w:tc>
+          <w:tcPr/>
+          <w:p>
+            <w:pPr>
+              <w:pStyle w:val="Compact"/>
+            </w:pPr>
+            <w:r>
+              <w:t xml:space="preserve">To close</w:t>
+            </w:r>
+          </w:p>
+        </w:tc>
+        <w:tc>
+          <w:tcPr/>
+          <w:p>
+            <w:pPr>
+              <w:pStyle w:val="Compact"/>
+            </w:pPr>
+            <w:r>
+              <w:t xml:space="preserve">Bookings with an operator that ended and nobody recorded (not started or not finished). It only appears when there is at least one, on the web and in the mobile app.</w:t>
+            </w:r>
+          </w:p>
+        </w:tc>
+        <w:tc>
+          <w:tcPr/>
+          <w:p>
+            <w:pPr>
+              <w:pStyle w:val="Compact"/>
+            </w:pPr>
+            <w:r>
+              <w:rPr>
+                <w:b/>
+                <w:bCs/>
+              </w:rPr>
+              <w:t xml:space="preserve">Attended</w:t>
+            </w:r>
+            <w:r>
+              <w:t xml:space="preserve"> </w:t>
+            </w:r>
+            <w:r>
+              <w:t xml:space="preserve">or</w:t>
+            </w:r>
+            <w:r>
+              <w:t xml:space="preserve"> </w:t>
+            </w:r>
+            <w:r>
+              <w:rPr>
+                <w:b/>
+                <w:bCs/>
+              </w:rPr>
+              <w:t xml:space="preserve">No-show</w:t>
+            </w:r>
+            <w:r>
+              <w:t xml:space="preserve"> </w:t>
+            </w:r>
+            <w:r>
+              <w:t xml:space="preserve">(section 12.3).</w:t>
             </w:r>
           </w:p>
         </w:tc>
@@ -5843,7 +6152,7 @@
         </w:numPr>
       </w:pPr>
       <w:r>
-        <w:t xml:space="preserve">Confirm the message "Deactivate [name]? They will no longer be able to log in."</w:t>
+        <w:t xml:space="preserve">Confirm the message "Deactivate [name]? They will no longer be able to log in." Since October 21, 2026, if the person had an open session, that session stops working within 30 seconds on all their devices.</w:t>
       </w:r>
     </w:p>
     <w:p>
@@ -6171,7 +6480,7 @@
         <w:t xml:space="preserve"> </w:t>
       </w:r>
       <w:r>
-        <w:t xml:space="preserve">(start, expiry, revocation, IP address, and browser agent). Logging out marks the session as revoked. A token already issued cannot be revoked before it expires (one hour); it is a risk accepted in the design (ADR-006). When a compromise is suspected, deactivate the account, change the JWT secret if the compromise affects the platform, and review the sessions:</w:t>
+        <w:t xml:space="preserve">(start, expiry, revocation, IP address, and browser agent). Logging out marks the session as revoked, and deactivating the account revokes all its sessions. Since October 21, 2026 the token of a revoked session stops working: security-service rejects it and the API Gateway cuts it before it reaches the other services, with a margin of up to 30 seconds (if security-service does not answer, the token works until it expires, as before). When a compromise is suspected, deactivate the account, change the JWT secret if the compromise affects the platform, and review the sessions:</w:t>
       </w:r>
     </w:p>
     <w:p>
@@ -6430,7 +6739,7 @@
         <w:t xml:space="preserve">The matrix is informative</w:t>
       </w:r>
       <w:r>
-        <w:t xml:space="preserve">: real authorization still depends on the role of the token, so checking or unchecking a permission does not grant or remove access to any screen or endpoint (ADR-015). If a permission no longer exists, the system answers "One of the selected permissions no longer exists. Reload the page and try again."</w:t>
+        <w:t xml:space="preserve">: real authorization still depends on the role of the token, so checking or unchecking a permission does not grant or remove access to any screen or endpoint (ADR-015). Since October 21, 2026 the permissions tab and dialog explain it on screen: the roles are fixed and the role decides the access. If a permission no longer exists, the system answers "One of the selected permissions no longer exists. Reload the page and try again."</w:t>
       </w:r>
     </w:p>
     <w:p>
@@ -7058,7 +7367,7 @@
         <w:pStyle w:val="FirstParagraph"/>
       </w:pPr>
       <w:r>
-        <w:t xml:space="preserve">A valid role is not enough: each service also verifies the ownership of the resource. An operator cannot start or finish a service assigned to another operator, and a customer only reaches their own bookings, vehicles, and payments. Each service validates the token and the role required by each route; the gateway only routes the requests and does not validate tokens (ADR-006). A request from one role to a resource of another returns error 403.</w:t>
+        <w:t xml:space="preserve">A valid role is not enough: each service also verifies the ownership of the resource. An operator cannot start or finish a service assigned to another operator, and a customer only reaches their own bookings, vehicles, and payments. Each service validates the token and the role required by each route; the gateway routes the requests and does not check the token signature (ADR-006), but since October 21, 2026 it cuts the tokens of closed sessions. A request from one role to a resource of another returns error 403.</w:t>
       </w:r>
     </w:p>
     <w:bookmarkEnd w:id="61"/>
@@ -8247,7 +8556,17 @@
         <w:t xml:space="preserve"> </w:t>
       </w:r>
       <w:r>
-        <w:t xml:space="preserve">manages the payment accounts of the business: for each account, the method (Nequi, Daviplata, or bank transfer), the holder, the account number, the QR image, the instructions, and whether it is active. Customers see only the active accounts of the methods that require a receipt; cash does not have a QR code. A wrong QR code or account sends the business's money to a third party, so this information must be reviewed carefully.</w:t>
+        <w:t xml:space="preserve">manages the payment accounts of the business: for each account, the method (Nequi, Daviplata, or bank transfer), the holder, the account number, the QR image, the instructions, and whether it is active. Customers see only the active accounts. The cash account (</w:t>
+      </w:r>
+      <w:r>
+        <w:rPr>
+          <w:i/>
+          <w:iCs/>
+        </w:rPr>
+        <w:t xml:space="preserve">Caja del establecimiento</w:t>
+      </w:r>
+      <w:r>
+        <w:t xml:space="preserve">) appears in the same list and has no QR code; since October 21, 2026, if it is deactivated, the Cash option disappears from the customer payment screen. A wrong QR code or account sends the business's money to a third party, so this information must be reviewed carefully.</w:t>
       </w:r>
     </w:p>
     <w:p>
@@ -8547,6 +8866,51 @@
               <w:pStyle w:val="Compact"/>
             </w:pPr>
             <w:r>
+              <w:t xml:space="preserve">Closed session</w:t>
+            </w:r>
+          </w:p>
+        </w:tc>
+        <w:tc>
+          <w:tcPr/>
+          <w:p>
+            <w:pPr>
+              <w:pStyle w:val="Compact"/>
+            </w:pPr>
+            <w:r>
+              <w:t xml:space="preserve">The token of a closed session (sign-out or deactivated account) stops working within 30 seconds (since October 21, 2026)</w:t>
+            </w:r>
+          </w:p>
+        </w:tc>
+        <w:tc>
+          <w:tcPr/>
+          <w:p>
+            <w:pPr>
+              <w:pStyle w:val="Compact"/>
+            </w:pPr>
+            <w:r>
+              <w:t xml:space="preserve">security-service and API Gateway (</w:t>
+            </w:r>
+            <w:r>
+              <w:rPr>
+                <w:i/>
+                <w:iCs/>
+              </w:rPr>
+              <w:t xml:space="preserve">SESSION_CHECK_*</w:t>
+            </w:r>
+            <w:r>
+              <w:t xml:space="preserve">).</w:t>
+            </w:r>
+          </w:p>
+        </w:tc>
+      </w:tr>
+      <w:tr>
+        <w:tc>
+          <w:tcPr/>
+          <w:p>
+            <w:pPr>
+              <w:pStyle w:val="Compact"/>
+            </w:pPr>
+            <w:r>
               <w:t xml:space="preserve">Account lockout after failed attempts</w:t>
             </w:r>
           </w:p>
@@ -8953,7 +9317,100 @@
         <w:t xml:space="preserve"> </w:t>
       </w:r>
       <w:r>
-        <w:t xml:space="preserve">(internal calls between services). Their values and the change procedure are described in the Installation Manual.</w:t>
+        <w:t xml:space="preserve">(internal calls between services). Those of October 21, 2026,</w:t>
+      </w:r>
+      <w:r>
+        <w:t xml:space="preserve"> </w:t>
+      </w:r>
+      <w:r>
+        <w:rPr>
+          <w:i/>
+          <w:iCs/>
+        </w:rPr>
+        <w:t xml:space="preserve">SESSION_CHECK_*</w:t>
+      </w:r>
+      <w:r>
+        <w:t xml:space="preserve"> </w:t>
+      </w:r>
+      <w:r>
+        <w:t xml:space="preserve">(gateway session check),</w:t>
+      </w:r>
+      <w:r>
+        <w:t xml:space="preserve"> </w:t>
+      </w:r>
+      <w:r>
+        <w:rPr>
+          <w:i/>
+          <w:iCs/>
+        </w:rPr>
+        <w:t xml:space="preserve">BOOKING_EXPIRY_*</w:t>
+      </w:r>
+      <w:r>
+        <w:t xml:space="preserve"> </w:t>
+      </w:r>
+      <w:r>
+        <w:t xml:space="preserve">(bookings that ended without being closed;</w:t>
+      </w:r>
+      <w:r>
+        <w:t xml:space="preserve"> </w:t>
+      </w:r>
+      <w:r>
+        <w:rPr>
+          <w:i/>
+          <w:iCs/>
+        </w:rPr>
+        <w:t xml:space="preserve">BOOKING_EXPIRY_GRACE_MINUTES</w:t>
+      </w:r>
+      <w:r>
+        <w:t xml:space="preserve"> </w:t>
+      </w:r>
+      <w:r>
+        <w:t xml:space="preserve">is used by booking-service and operations-service), and</w:t>
+      </w:r>
+      <w:r>
+        <w:t xml:space="preserve"> </w:t>
+      </w:r>
+      <w:r>
+        <w:rPr>
+          <w:i/>
+          <w:iCs/>
+        </w:rPr>
+        <w:t xml:space="preserve">FOLLOW_UP_*</w:t>
+      </w:r>
+      <w:r>
+        <w:t xml:space="preserve"> </w:t>
+      </w:r>
+      <w:r>
+        <w:t xml:space="preserve">(check of the</w:t>
+      </w:r>
+      <w:r>
+        <w:t xml:space="preserve"> </w:t>
+      </w:r>
+      <w:r>
+        <w:rPr>
+          <w:b/>
+          <w:bCs/>
+        </w:rPr>
+        <w:t xml:space="preserve">To close</w:t>
+      </w:r>
+      <w:r>
+        <w:t xml:space="preserve"> </w:t>
+      </w:r>
+      <w:r>
+        <w:t xml:space="preserve">list in operations-service), have defaults and do not go through the Compose file yet, so in Docker they are not changed from</w:t>
+      </w:r>
+      <w:r>
+        <w:t xml:space="preserve"> </w:t>
+      </w:r>
+      <w:r>
+        <w:rPr>
+          <w:i/>
+          <w:iCs/>
+        </w:rPr>
+        <w:t xml:space="preserve">.env</w:t>
+      </w:r>
+      <w:r>
+        <w:t xml:space="preserve">. Their values and the change procedure are described in the Installation Manual.</w:t>
       </w:r>
     </w:p>
     <w:bookmarkEnd w:id="78"/>
@@ -9858,7 +10315,7 @@
           <w:b/>
           <w:bCs/>
         </w:rPr>
-        <w:t xml:space="preserve">No show</w:t>
+        <w:t xml:space="preserve">No-show</w:t>
       </w:r>
       <w:r>
         <w:t xml:space="preserve">), or cancel it by choosing a</w:t>
@@ -9916,6 +10373,351 @@
     <w:p>
       <w:pPr>
         <w:pStyle w:val="BodyText"/>
+      </w:pPr>
+      <w:r>
+        <w:rPr>
+          <w:b/>
+          <w:bCs/>
+        </w:rPr>
+        <w:t xml:space="preserve">Bookings that ended without being closed (since October 21, 2026).</w:t>
+      </w:r>
+      <w:r>
+        <w:t xml:space="preserve"> </w:t>
+      </w:r>
+      <w:r>
+        <w:t xml:space="preserve">The system only closes a booking on its own when there is no doubt about what happened; in the other cases the administrator decides:</w:t>
+      </w:r>
+    </w:p>
+    <w:p>
+      <w:pPr>
+        <w:pStyle w:val="Compact"/>
+        <w:numPr>
+          <w:ilvl w:val="0"/>
+          <w:numId w:val="1035"/>
+        </w:numPr>
+      </w:pPr>
+      <w:r>
+        <w:t xml:space="preserve">A</w:t>
+      </w:r>
+      <w:r>
+        <w:t xml:space="preserve"> </w:t>
+      </w:r>
+      <w:r>
+        <w:rPr>
+          <w:b/>
+          <w:bCs/>
+        </w:rPr>
+        <w:t xml:space="preserve">Scheduled</w:t>
+      </w:r>
+      <w:r>
+        <w:t xml:space="preserve"> </w:t>
+      </w:r>
+      <w:r>
+        <w:t xml:space="preserve">booking that was never confirmed is cancelled on its own one hour after its end time, with the reason "Venció sin confirmarse" (expired without confirmation), which does not appear in the list of reasons for cancelling by hand.</w:t>
+      </w:r>
+    </w:p>
+    <w:p>
+      <w:pPr>
+        <w:pStyle w:val="Compact"/>
+        <w:numPr>
+          <w:ilvl w:val="0"/>
+          <w:numId w:val="1035"/>
+        </w:numPr>
+      </w:pPr>
+      <w:r>
+        <w:t xml:space="preserve">A</w:t>
+      </w:r>
+      <w:r>
+        <w:t xml:space="preserve"> </w:t>
+      </w:r>
+      <w:r>
+        <w:rPr>
+          <w:b/>
+          <w:bCs/>
+        </w:rPr>
+        <w:t xml:space="preserve">Confirmed</w:t>
+      </w:r>
+      <w:r>
+        <w:t xml:space="preserve"> </w:t>
+      </w:r>
+      <w:r>
+        <w:t xml:space="preserve">booking that never had an operator becomes</w:t>
+      </w:r>
+      <w:r>
+        <w:t xml:space="preserve"> </w:t>
+      </w:r>
+      <w:r>
+        <w:rPr>
+          <w:b/>
+          <w:bCs/>
+        </w:rPr>
+        <w:t xml:space="preserve">No-show</w:t>
+      </w:r>
+      <w:r>
+        <w:t xml:space="preserve"> </w:t>
+      </w:r>
+      <w:r>
+        <w:t xml:space="preserve">on its own one hour after its end, because nobody could serve it.</w:t>
+      </w:r>
+    </w:p>
+    <w:p>
+      <w:pPr>
+        <w:pStyle w:val="Compact"/>
+        <w:numPr>
+          <w:ilvl w:val="0"/>
+          <w:numId w:val="1035"/>
+        </w:numPr>
+      </w:pPr>
+      <w:r>
+        <w:t xml:space="preserve">A</w:t>
+      </w:r>
+      <w:r>
+        <w:t xml:space="preserve"> </w:t>
+      </w:r>
+      <w:r>
+        <w:rPr>
+          <w:b/>
+          <w:bCs/>
+        </w:rPr>
+        <w:t xml:space="preserve">Confirmed booking with an operator</w:t>
+      </w:r>
+      <w:r>
+        <w:t xml:space="preserve"> </w:t>
+      </w:r>
+      <w:r>
+        <w:t xml:space="preserve">that nobody started when its time ended, or an</w:t>
+      </w:r>
+      <w:r>
+        <w:t xml:space="preserve"> </w:t>
+      </w:r>
+      <w:r>
+        <w:rPr>
+          <w:b/>
+          <w:bCs/>
+        </w:rPr>
+        <w:t xml:space="preserve">In progress</w:t>
+      </w:r>
+      <w:r>
+        <w:t xml:space="preserve"> </w:t>
+      </w:r>
+      <w:r>
+        <w:t xml:space="preserve">booking that nobody finished one hour after its end, is never marked on its own: it goes to the</w:t>
+      </w:r>
+      <w:r>
+        <w:t xml:space="preserve"> </w:t>
+      </w:r>
+      <w:r>
+        <w:rPr>
+          <w:b/>
+          <w:bCs/>
+        </w:rPr>
+        <w:t xml:space="preserve">To close</w:t>
+      </w:r>
+      <w:r>
+        <w:t xml:space="preserve"> </w:t>
+      </w:r>
+      <w:r>
+        <w:t xml:space="preserve">card of the home screen. The operator receives the notice "¿Atendiste este servicio?" (did you serve this booking?) and every active administrator the notice "Servicio sin registrar" (service not recorded) (section 12.7).</w:t>
+      </w:r>
+    </w:p>
+    <w:p>
+      <w:pPr>
+        <w:pStyle w:val="FirstParagraph"/>
+      </w:pPr>
+      <w:r>
+        <w:t xml:space="preserve">This rule replaced the first version of the same day, which closed as No-show every booking that nobody started: if the operator washed the vehicle and forgot to press</w:t>
+      </w:r>
+      <w:r>
+        <w:t xml:space="preserve"> </w:t>
+      </w:r>
+      <w:r>
+        <w:rPr>
+          <w:b/>
+          <w:bCs/>
+        </w:rPr>
+        <w:t xml:space="preserve">Start</w:t>
+      </w:r>
+      <w:r>
+        <w:t xml:space="preserve">, the record said that the customer did not come. The system never makes refunds: if the booking was paid, the administrator reviews the payment in</w:t>
+      </w:r>
+      <w:r>
+        <w:t xml:space="preserve"> </w:t>
+      </w:r>
+      <w:r>
+        <w:rPr>
+          <w:b/>
+          <w:bCs/>
+        </w:rPr>
+        <w:t xml:space="preserve">Payments</w:t>
+      </w:r>
+      <w:r>
+        <w:t xml:space="preserve"> </w:t>
+      </w:r>
+      <w:r>
+        <w:t xml:space="preserve">(section 12.6).</w:t>
+      </w:r>
+    </w:p>
+    <w:p>
+      <w:pPr>
+        <w:pStyle w:val="BodyText"/>
+      </w:pPr>
+      <w:r>
+        <w:t xml:space="preserve">To close the pending bookings:</w:t>
+      </w:r>
+    </w:p>
+    <w:p>
+      <w:pPr>
+        <w:pStyle w:val="Compact"/>
+        <w:numPr>
+          <w:ilvl w:val="0"/>
+          <w:numId w:val="1036"/>
+        </w:numPr>
+      </w:pPr>
+      <w:r>
+        <w:t xml:space="preserve">Find the</w:t>
+      </w:r>
+      <w:r>
+        <w:t xml:space="preserve"> </w:t>
+      </w:r>
+      <w:r>
+        <w:rPr>
+          <w:b/>
+          <w:bCs/>
+        </w:rPr>
+        <w:t xml:space="preserve">To close</w:t>
+      </w:r>
+      <w:r>
+        <w:t xml:space="preserve"> </w:t>
+      </w:r>
+      <w:r>
+        <w:t xml:space="preserve">card on the web</w:t>
+      </w:r>
+      <w:r>
+        <w:t xml:space="preserve"> </w:t>
+      </w:r>
+      <w:r>
+        <w:rPr>
+          <w:b/>
+          <w:bCs/>
+        </w:rPr>
+        <w:t xml:space="preserve">Dashboard</w:t>
+      </w:r>
+      <w:r>
+        <w:t xml:space="preserve"> </w:t>
+      </w:r>
+      <w:r>
+        <w:t xml:space="preserve">or on the home screen of the mobile app. It only appears when there is a pending booking and shows those of the last week.</w:t>
+      </w:r>
+    </w:p>
+    <w:p>
+      <w:pPr>
+        <w:pStyle w:val="Compact"/>
+        <w:numPr>
+          <w:ilvl w:val="0"/>
+          <w:numId w:val="1036"/>
+        </w:numPr>
+      </w:pPr>
+      <w:r>
+        <w:t xml:space="preserve">Check with the operator whether the vehicle was served. If it is still the same day, the operator can record the service with</w:t>
+      </w:r>
+      <w:r>
+        <w:t xml:space="preserve"> </w:t>
+      </w:r>
+      <w:r>
+        <w:rPr>
+          <w:b/>
+          <w:bCs/>
+        </w:rPr>
+        <w:t xml:space="preserve">Start</w:t>
+      </w:r>
+      <w:r>
+        <w:t xml:space="preserve"> </w:t>
+      </w:r>
+      <w:r>
+        <w:t xml:space="preserve">and</w:t>
+      </w:r>
+      <w:r>
+        <w:t xml:space="preserve"> </w:t>
+      </w:r>
+      <w:r>
+        <w:rPr>
+          <w:b/>
+          <w:bCs/>
+        </w:rPr>
+        <w:t xml:space="preserve">Finish</w:t>
+      </w:r>
+      <w:r>
+        <w:t xml:space="preserve"> </w:t>
+      </w:r>
+      <w:r>
+        <w:t xml:space="preserve">even if it is late; this keeps the real hours and the booking leaves the list.</w:t>
+      </w:r>
+    </w:p>
+    <w:p>
+      <w:pPr>
+        <w:pStyle w:val="Compact"/>
+        <w:numPr>
+          <w:ilvl w:val="0"/>
+          <w:numId w:val="1036"/>
+        </w:numPr>
+      </w:pPr>
+      <w:r>
+        <w:t xml:space="preserve">If the vehicle was served, click</w:t>
+      </w:r>
+      <w:r>
+        <w:t xml:space="preserve"> </w:t>
+      </w:r>
+      <w:r>
+        <w:rPr>
+          <w:b/>
+          <w:bCs/>
+        </w:rPr>
+        <w:t xml:space="preserve">Attended</w:t>
+      </w:r>
+      <w:r>
+        <w:t xml:space="preserve">. The booking becomes Completed without made-up hours: without a start time it does not count toward the operator's punctuality and without an end time it does not add worked hours, but it does count as a service done and as income. The customer does not receive the notice that the vehicle is ready for pickup (it would arrive hours late), but can still rate the service.</w:t>
+      </w:r>
+    </w:p>
+    <w:p>
+      <w:pPr>
+        <w:pStyle w:val="Compact"/>
+        <w:numPr>
+          <w:ilvl w:val="0"/>
+          <w:numId w:val="1036"/>
+        </w:numPr>
+      </w:pPr>
+      <w:r>
+        <w:t xml:space="preserve">If the customer did not come, click</w:t>
+      </w:r>
+      <w:r>
+        <w:t xml:space="preserve"> </w:t>
+      </w:r>
+      <w:r>
+        <w:rPr>
+          <w:b/>
+          <w:bCs/>
+        </w:rPr>
+        <w:t xml:space="preserve">No-show</w:t>
+      </w:r>
+      <w:r>
+        <w:t xml:space="preserve">. This option only applies to a booking that was never started, and the status is final.</w:t>
+      </w:r>
+    </w:p>
+    <w:p>
+      <w:pPr>
+        <w:pStyle w:val="Compact"/>
+        <w:numPr>
+          <w:ilvl w:val="0"/>
+          <w:numId w:val="1036"/>
+        </w:numPr>
+      </w:pPr>
+      <w:r>
+        <w:t xml:space="preserve">If a message says that the booking is no longer to close, another administrator or the operator closed it first; just refresh the screen.</w:t>
+      </w:r>
+    </w:p>
+    <w:p>
+      <w:pPr>
+        <w:pStyle w:val="FirstParagraph"/>
       </w:pPr>
       <w:r>
         <w:rPr>
@@ -10145,7 +10947,7 @@
               <w:pStyle w:val="Compact"/>
             </w:pPr>
             <w:r>
-              <w:t xml:space="preserve">Voided by the customer or the business.</w:t>
+              <w:t xml:space="preserve">Voided by the customer or the business, or closed by the system because one hour passed after its end without being confirmed.</w:t>
             </w:r>
           </w:p>
         </w:tc>
@@ -10180,18 +10982,18 @@
               <w:pStyle w:val="Compact"/>
             </w:pPr>
             <w:r>
-              <w:t xml:space="preserve">The customer did not arrive.</w:t>
-            </w:r>
-          </w:p>
-        </w:tc>
-        <w:tc>
-          <w:tcPr/>
-          <w:p>
-            <w:pPr>
-              <w:pStyle w:val="Compact"/>
-            </w:pPr>
-            <w:r>
-              <w:t xml:space="preserve">Record it and review patterns.</w:t>
+              <w:t xml:space="preserve">The customer did not arrive (marked by the administrator), or the confirmed booking ended one hour ago without an operator (marked by the system).</w:t>
+            </w:r>
+          </w:p>
+        </w:tc>
+        <w:tc>
+          <w:tcPr/>
+          <w:p>
+            <w:pPr>
+              <w:pStyle w:val="Compact"/>
+            </w:pPr>
+            <w:r>
+              <w:t xml:space="preserve">Record it, review patterns and, if the customer had paid, decide on the refund.</w:t>
             </w:r>
           </w:p>
         </w:tc>
@@ -10333,7 +11135,23 @@
         <w:t xml:space="preserve"> </w:t>
       </w:r>
       <w:r>
-        <w:t xml:space="preserve">block of the Dashboard. A rescheduled booking keeps its operator. The administrator assigns by hand in two cases: when the booking was left without an operator and when the assigned one must be changed.</w:t>
+        <w:t xml:space="preserve">block of the Dashboard. Since October 21, 2026 the Dashboard and the</w:t>
+      </w:r>
+      <w:r>
+        <w:t xml:space="preserve"> </w:t>
+      </w:r>
+      <w:r>
+        <w:rPr>
+          <w:b/>
+          <w:bCs/>
+        </w:rPr>
+        <w:t xml:space="preserve">Bookings</w:t>
+      </w:r>
+      <w:r>
+        <w:t xml:space="preserve"> </w:t>
+      </w:r>
+      <w:r>
+        <w:t xml:space="preserve">screen, on the web and in the mobile app, use the same count: scheduled or confirmed bookings, with no operator on any service, whose time has not ended yet. A rescheduled booking keeps its operator. The administrator assigns by hand in two cases: when the booking was left without an operator and when the assigned one must be changed.</w:t>
       </w:r>
     </w:p>
     <w:p>
@@ -10341,7 +11159,7 @@
         <w:pStyle w:val="Compact"/>
         <w:numPr>
           <w:ilvl w:val="0"/>
-          <w:numId w:val="1035"/>
+          <w:numId w:val="1037"/>
         </w:numPr>
       </w:pPr>
       <w:r>
@@ -10411,7 +11229,7 @@
         <w:pStyle w:val="Compact"/>
         <w:numPr>
           <w:ilvl w:val="0"/>
-          <w:numId w:val="1035"/>
+          <w:numId w:val="1037"/>
         </w:numPr>
       </w:pPr>
       <w:r>
@@ -10475,7 +11293,7 @@
         <w:pStyle w:val="Compact"/>
         <w:numPr>
           <w:ilvl w:val="0"/>
-          <w:numId w:val="1035"/>
+          <w:numId w:val="1037"/>
         </w:numPr>
       </w:pPr>
       <w:r>
@@ -10487,7 +11305,7 @@
         <w:pStyle w:val="Compact"/>
         <w:numPr>
           <w:ilvl w:val="0"/>
-          <w:numId w:val="1035"/>
+          <w:numId w:val="1037"/>
         </w:numPr>
       </w:pPr>
       <w:r>
@@ -10520,7 +11338,7 @@
         <w:pStyle w:val="BodyText"/>
       </w:pPr>
       <w:r>
-        <w:t xml:space="preserve">Only bookings in SCHEDULED or CONFIRMED status can be assigned, and the operator can be changed while no line of the booking has started. If an operator who is not eligible is chosen, the server rejects the assignment and explains the reason.</w:t>
+        <w:t xml:space="preserve">Only bookings in SCHEDULED or CONFIRMED status can be assigned, and the operator can be changed while no line of the booking has started. If an operator who is not eligible is chosen, the server rejects the assignment and explains the reason. If the automatic assignment and a manual one happen at the same time, the system runs them one after the other, so an operator does not end up with two services at the same time.</w:t>
       </w:r>
     </w:p>
     <w:p>
@@ -10617,7 +11435,7 @@
         <w:pStyle w:val="Compact"/>
         <w:numPr>
           <w:ilvl w:val="0"/>
-          <w:numId w:val="1036"/>
+          <w:numId w:val="1038"/>
         </w:numPr>
       </w:pPr>
       <w:r>
@@ -10655,7 +11473,7 @@
         <w:pStyle w:val="Compact"/>
         <w:numPr>
           <w:ilvl w:val="0"/>
-          <w:numId w:val="1036"/>
+          <w:numId w:val="1038"/>
         </w:numPr>
       </w:pPr>
       <w:r>
@@ -10683,7 +11501,7 @@
         <w:pStyle w:val="Compact"/>
         <w:numPr>
           <w:ilvl w:val="0"/>
-          <w:numId w:val="1036"/>
+          <w:numId w:val="1038"/>
         </w:numPr>
       </w:pPr>
       <w:r>
@@ -10737,7 +11555,7 @@
         <w:pStyle w:val="Compact"/>
         <w:numPr>
           <w:ilvl w:val="0"/>
-          <w:numId w:val="1036"/>
+          <w:numId w:val="1038"/>
         </w:numPr>
       </w:pPr>
       <w:r>
@@ -10791,7 +11609,7 @@
         <w:pStyle w:val="Compact"/>
         <w:numPr>
           <w:ilvl w:val="0"/>
-          <w:numId w:val="1036"/>
+          <w:numId w:val="1038"/>
         </w:numPr>
       </w:pPr>
       <w:r>
@@ -10847,7 +11665,7 @@
         <w:pStyle w:val="Compact"/>
         <w:numPr>
           <w:ilvl w:val="0"/>
-          <w:numId w:val="1037"/>
+          <w:numId w:val="1039"/>
         </w:numPr>
       </w:pPr>
       <w:r>
@@ -10885,7 +11703,7 @@
         <w:pStyle w:val="Compact"/>
         <w:numPr>
           <w:ilvl w:val="0"/>
-          <w:numId w:val="1037"/>
+          <w:numId w:val="1039"/>
         </w:numPr>
       </w:pPr>
       <w:r>
@@ -10971,7 +11789,7 @@
         <w:pStyle w:val="Compact"/>
         <w:numPr>
           <w:ilvl w:val="0"/>
-          <w:numId w:val="1037"/>
+          <w:numId w:val="1039"/>
         </w:numPr>
       </w:pPr>
       <w:r>
@@ -11025,7 +11843,7 @@
         <w:pStyle w:val="Compact"/>
         <w:numPr>
           <w:ilvl w:val="0"/>
-          <w:numId w:val="1037"/>
+          <w:numId w:val="1039"/>
         </w:numPr>
       </w:pPr>
       <w:r>
@@ -11460,6 +12278,51 @@
           </w:p>
         </w:tc>
       </w:tr>
+      <w:tr>
+        <w:tc>
+          <w:tcPr/>
+          <w:p>
+            <w:pPr>
+              <w:pStyle w:val="Compact"/>
+            </w:pPr>
+            <w:r>
+              <w:t xml:space="preserve">Receipt size</w:t>
+            </w:r>
+          </w:p>
+        </w:tc>
+        <w:tc>
+          <w:tcPr/>
+          <w:p>
+            <w:pPr>
+              <w:pStyle w:val="Compact"/>
+            </w:pPr>
+            <w:r>
+              <w:t xml:space="preserve">The server rejects receipts larger than 2 MB (</w:t>
+            </w:r>
+            <w:r>
+              <w:rPr>
+                <w:i/>
+                <w:iCs/>
+              </w:rPr>
+              <w:t xml:space="preserve">RECEIPT_TOO_LARGE</w:t>
+            </w:r>
+            <w:r>
+              <w:t xml:space="preserve">); the web and the app reduce them before sending them.</w:t>
+            </w:r>
+          </w:p>
+        </w:tc>
+        <w:tc>
+          <w:tcPr/>
+          <w:p>
+            <w:pPr>
+              <w:pStyle w:val="Compact"/>
+            </w:pPr>
+            <w:r>
+              <w:t xml:space="preserve">If an image looks blurry, ask the customer for a screenshot of the receipt.</w:t>
+            </w:r>
+          </w:p>
+        </w:tc>
+      </w:tr>
     </w:tbl>
     <w:p>
       <w:pPr>
@@ -11496,7 +12359,7 @@
         <w:pStyle w:val="Compact"/>
         <w:numPr>
           <w:ilvl w:val="0"/>
-          <w:numId w:val="1038"/>
+          <w:numId w:val="1040"/>
         </w:numPr>
       </w:pPr>
       <w:r>
@@ -11550,7 +12413,7 @@
         <w:pStyle w:val="Compact"/>
         <w:numPr>
           <w:ilvl w:val="0"/>
-          <w:numId w:val="1038"/>
+          <w:numId w:val="1040"/>
         </w:numPr>
       </w:pPr>
       <w:r>
@@ -11623,7 +12486,7 @@
         <w:pStyle w:val="Compact"/>
         <w:numPr>
           <w:ilvl w:val="0"/>
-          <w:numId w:val="1038"/>
+          <w:numId w:val="1040"/>
         </w:numPr>
       </w:pPr>
       <w:r>
@@ -11635,7 +12498,7 @@
         <w:pStyle w:val="Compact"/>
         <w:numPr>
           <w:ilvl w:val="0"/>
-          <w:numId w:val="1038"/>
+          <w:numId w:val="1040"/>
         </w:numPr>
       </w:pPr>
       <w:r>
@@ -11947,7 +12810,23 @@
         <w:t xml:space="preserve">Go to home</w:t>
       </w:r>
       <w:r>
-        <w:t xml:space="preserve">. Every active administrator receives staff notices in the inbox and as push notifications (never by email): a new booking confirmed, a booking moved to another time, and a booking cancelled (with the reason).</w:t>
+        <w:t xml:space="preserve">. Every active administrator receives staff notices in the inbox and as push notifications (never by email): a new booking confirmed, a booking moved to another time, a booking cancelled (with the reason) and, since October 21, 2026, the notice "Servicio sin registrar" (service not recorded) when a booking with an operator ended and nobody started or finished it. That notice arrives only once per booking and opens the home screen, where the booking appears in</w:t>
+      </w:r>
+      <w:r>
+        <w:t xml:space="preserve"> </w:t>
+      </w:r>
+      <w:r>
+        <w:rPr>
+          <w:b/>
+          <w:bCs/>
+        </w:rPr>
+        <w:t xml:space="preserve">To close</w:t>
+      </w:r>
+      <w:r>
+        <w:t xml:space="preserve"> </w:t>
+      </w:r>
+      <w:r>
+        <w:t xml:space="preserve">(section 12.3).</w:t>
       </w:r>
     </w:p>
     <w:p>
@@ -12183,7 +13062,7 @@
         <w:pStyle w:val="Compact"/>
         <w:numPr>
           <w:ilvl w:val="0"/>
-          <w:numId w:val="1039"/>
+          <w:numId w:val="1041"/>
         </w:numPr>
       </w:pPr>
       <w:r>
@@ -12253,7 +13132,7 @@
         <w:pStyle w:val="Compact"/>
         <w:numPr>
           <w:ilvl w:val="0"/>
-          <w:numId w:val="1039"/>
+          <w:numId w:val="1041"/>
         </w:numPr>
       </w:pPr>
       <w:r>
@@ -12278,7 +13157,7 @@
         <w:pStyle w:val="Compact"/>
         <w:numPr>
           <w:ilvl w:val="0"/>
-          <w:numId w:val="1039"/>
+          <w:numId w:val="1041"/>
         </w:numPr>
       </w:pPr>
       <w:r>
@@ -12306,7 +13185,7 @@
         <w:pStyle w:val="Compact"/>
         <w:numPr>
           <w:ilvl w:val="0"/>
-          <w:numId w:val="1039"/>
+          <w:numId w:val="1041"/>
         </w:numPr>
       </w:pPr>
       <w:r>
@@ -12374,7 +13253,7 @@
         <w:pStyle w:val="Compact"/>
         <w:numPr>
           <w:ilvl w:val="0"/>
-          <w:numId w:val="1040"/>
+          <w:numId w:val="1042"/>
         </w:numPr>
       </w:pPr>
       <w:r>
@@ -12441,7 +13320,7 @@
         <w:pStyle w:val="Compact"/>
         <w:numPr>
           <w:ilvl w:val="0"/>
-          <w:numId w:val="1040"/>
+          <w:numId w:val="1042"/>
         </w:numPr>
       </w:pPr>
       <w:r>
@@ -12461,7 +13340,7 @@
         <w:t xml:space="preserve"> </w:t>
       </w:r>
       <w:r>
-        <w:t xml:space="preserve">of services completed and revenue for the period.</w:t>
+        <w:t xml:space="preserve">of services completed and revenue for the period. Since October 21, 2026 the cards and the charts count only completed bookings as services done.</w:t>
       </w:r>
     </w:p>
     <w:p>
@@ -12469,7 +13348,7 @@
         <w:pStyle w:val="Compact"/>
         <w:numPr>
           <w:ilvl w:val="0"/>
-          <w:numId w:val="1040"/>
+          <w:numId w:val="1042"/>
         </w:numPr>
       </w:pPr>
       <w:r>
@@ -12549,7 +13428,7 @@
         <w:pStyle w:val="Compact"/>
         <w:numPr>
           <w:ilvl w:val="0"/>
-          <w:numId w:val="1040"/>
+          <w:numId w:val="1042"/>
         </w:numPr>
       </w:pPr>
       <w:r>
@@ -14287,7 +15166,7 @@
     </w:p>
     <w:bookmarkEnd w:id="104"/>
     <w:bookmarkEnd w:id="105"/>
-    <w:bookmarkStart w:id="114" w:name="X5feee61aac9491cdf0587d5b013ab8fc5501b89"/>
+    <w:bookmarkStart w:id="115" w:name="X5feee61aac9491cdf0587d5b013ab8fc5501b89"/>
     <w:p>
       <w:pPr>
         <w:pStyle w:val="Heading2"/>
@@ -14301,7 +15180,23 @@
         <w:pStyle w:val="FirstParagraph"/>
       </w:pPr>
       <w:r>
-        <w:t xml:space="preserve">The project documentation does not define a backup strategy, because production is outside its scope, and the application does not include a backup module. Therefore, backups are a task of the IT administrator on SQL Server and the Docker volumes. This section proposes a procedure based on contingency planning practices (Swanson et al., 2010) and on the SQL Server documentation (Microsoft, n.d.). The values marked as recommendations must be approved by the team (Annex B).</w:t>
+        <w:t xml:space="preserve">The project documentation does not define a backup strategy, because production is outside its scope, and the application does not include a backup module. Therefore, backups are a task of the IT administrator on SQL Server and the Docker volumes. On the public server, since October 21, 2026, that task is automated with the</w:t>
+      </w:r>
+      <w:r>
+        <w:t xml:space="preserve"> </w:t>
+      </w:r>
+      <w:r>
+        <w:rPr>
+          <w:i/>
+          <w:iCs/>
+        </w:rPr>
+        <w:t xml:space="preserve">lavarapido-infra/deploy</w:t>
+      </w:r>
+      <w:r>
+        <w:t xml:space="preserve"> </w:t>
+      </w:r>
+      <w:r>
+        <w:t xml:space="preserve">scripts (section 14.6); sections 14.1 to 14.5 apply to a local computer and help understand what those scripts do. This section proposes a procedure based on contingency planning practices (Swanson et al., 2010) and on the SQL Server documentation (Microsoft, n.d.). The values marked as recommendations must be approved by the team (Annex B).</w:t>
       </w:r>
     </w:p>
     <w:bookmarkStart w:id="106" w:name="Xf559ad4056f6d3b10fbb176de8e5242c4a65afa"/>
@@ -14574,29 +15469,45 @@
               <w:pStyle w:val="Compact"/>
             </w:pPr>
             <w:r>
-              <w:t xml:space="preserve">Browser-only data</w:t>
-            </w:r>
-          </w:p>
-        </w:tc>
-        <w:tc>
-          <w:tcPr/>
-          <w:p>
-            <w:pPr>
-              <w:pStyle w:val="Compact"/>
-            </w:pPr>
-            <w:r>
-              <w:t xml:space="preserve">Business data and inspection reports.</w:t>
-            </w:r>
-          </w:p>
-        </w:tc>
-        <w:tc>
-          <w:tcPr/>
-          <w:p>
-            <w:pPr>
-              <w:pStyle w:val="Compact"/>
-            </w:pPr>
-            <w:r>
-              <w:t xml:space="preserve">They are not on the server: they cannot be backed up by the IT administrator (section 6.3).</w:t>
+              <w:t xml:space="preserve">Business data and inspection reports</w:t>
+            </w:r>
+          </w:p>
+        </w:tc>
+        <w:tc>
+          <w:tcPr/>
+          <w:p>
+            <w:pPr>
+              <w:pStyle w:val="Compact"/>
+            </w:pPr>
+            <w:r>
+              <w:t xml:space="preserve">Since October 15, 2026 they are stored in booking-service and operations-service, inside</w:t>
+            </w:r>
+            <w:r>
+              <w:t xml:space="preserve"> </w:t>
+            </w:r>
+            <w:r>
+              <w:rPr>
+                <w:i/>
+                <w:iCs/>
+              </w:rPr>
+              <w:t xml:space="preserve">LavaRapido</w:t>
+            </w:r>
+            <w:r>
+              <w:t xml:space="preserve"> </w:t>
+            </w:r>
+            <w:r>
+              <w:t xml:space="preserve">(section 6.3).</w:t>
+            </w:r>
+          </w:p>
+        </w:tc>
+        <w:tc>
+          <w:tcPr/>
+          <w:p>
+            <w:pPr>
+              <w:pStyle w:val="Compact"/>
+            </w:pPr>
+            <w:r>
+              <w:t xml:space="preserve">Included in the BACKUP DATABASE.</w:t>
             </w:r>
           </w:p>
         </w:tc>
@@ -14991,7 +15902,7 @@
         <w:pStyle w:val="Compact"/>
         <w:numPr>
           <w:ilvl w:val="0"/>
-          <w:numId w:val="1041"/>
+          <w:numId w:val="1043"/>
         </w:numPr>
       </w:pPr>
       <w:r>
@@ -15003,7 +15914,7 @@
         <w:pStyle w:val="Compact"/>
         <w:numPr>
           <w:ilvl w:val="0"/>
-          <w:numId w:val="1041"/>
+          <w:numId w:val="1043"/>
         </w:numPr>
       </w:pPr>
       <w:r>
@@ -15015,7 +15926,7 @@
         <w:pStyle w:val="Compact"/>
         <w:numPr>
           <w:ilvl w:val="0"/>
-          <w:numId w:val="1041"/>
+          <w:numId w:val="1043"/>
         </w:numPr>
       </w:pPr>
       <w:r>
@@ -15027,7 +15938,7 @@
         <w:pStyle w:val="Compact"/>
         <w:numPr>
           <w:ilvl w:val="0"/>
-          <w:numId w:val="1041"/>
+          <w:numId w:val="1043"/>
         </w:numPr>
       </w:pPr>
       <w:r>
@@ -15039,7 +15950,7 @@
         <w:pStyle w:val="Compact"/>
         <w:numPr>
           <w:ilvl w:val="0"/>
-          <w:numId w:val="1041"/>
+          <w:numId w:val="1043"/>
         </w:numPr>
       </w:pPr>
       <w:r>
@@ -16075,7 +16986,7 @@
         <w:pStyle w:val="Compact"/>
         <w:numPr>
           <w:ilvl w:val="0"/>
-          <w:numId w:val="1042"/>
+          <w:numId w:val="1044"/>
         </w:numPr>
       </w:pPr>
       <w:r>
@@ -16103,7 +17014,7 @@
         <w:pStyle w:val="Compact"/>
         <w:numPr>
           <w:ilvl w:val="0"/>
-          <w:numId w:val="1042"/>
+          <w:numId w:val="1044"/>
         </w:numPr>
       </w:pPr>
       <w:r>
@@ -16115,7 +17026,7 @@
         <w:pStyle w:val="Compact"/>
         <w:numPr>
           <w:ilvl w:val="0"/>
-          <w:numId w:val="1042"/>
+          <w:numId w:val="1044"/>
         </w:numPr>
       </w:pPr>
       <w:r>
@@ -16139,8 +17050,214 @@
       </w:r>
     </w:p>
     <w:bookmarkEnd w:id="113"/>
+    <w:bookmarkStart w:id="114" w:name="Xc924d9342ec3f3874b9ca7467a676209c1c748e"/>
+    <w:p>
+      <w:pPr>
+        <w:pStyle w:val="Heading3"/>
+      </w:pPr>
+      <w:r>
+        <w:t xml:space="preserve">14.6 Automatic Backups of the Public Server</w:t>
+      </w:r>
+    </w:p>
+    <w:p>
+      <w:pPr>
+        <w:pStyle w:val="FirstParagraph"/>
+      </w:pPr>
+      <w:r>
+        <w:t xml:space="preserve">Since October 21, 2026 the public server backs up the database without intervention (Deployment Document, section 3.2):</w:t>
+      </w:r>
+    </w:p>
+    <w:p>
+      <w:pPr>
+        <w:pStyle w:val="Compact"/>
+        <w:numPr>
+          <w:ilvl w:val="0"/>
+          <w:numId w:val="1045"/>
+        </w:numPr>
+      </w:pPr>
+      <w:r>
+        <w:rPr>
+          <w:i/>
+          <w:iCs/>
+        </w:rPr>
+        <w:t xml:space="preserve">deploy/backup-db.sh</w:t>
+      </w:r>
+      <w:r>
+        <w:t xml:space="preserve"> </w:t>
+      </w:r>
+      <w:r>
+        <w:t xml:space="preserve">takes a full backup with a checksum, checks that it can be restored, and stores it compressed in</w:t>
+      </w:r>
+      <w:r>
+        <w:t xml:space="preserve"> </w:t>
+      </w:r>
+      <w:r>
+        <w:rPr>
+          <w:i/>
+          <w:iCs/>
+        </w:rPr>
+        <w:t xml:space="preserve">~/lavarapido/backups/</w:t>
+      </w:r>
+      <w:r>
+        <w:t xml:space="preserve">, with permissions for its owner only (600). The last 14 are kept.</w:t>
+      </w:r>
+    </w:p>
+    <w:p>
+      <w:pPr>
+        <w:pStyle w:val="Compact"/>
+        <w:numPr>
+          <w:ilvl w:val="0"/>
+          <w:numId w:val="1045"/>
+        </w:numPr>
+      </w:pPr>
+      <w:r>
+        <w:t xml:space="preserve">It runs before every update (if it fails,</w:t>
+      </w:r>
+      <w:r>
+        <w:t xml:space="preserve"> </w:t>
+      </w:r>
+      <w:r>
+        <w:rPr>
+          <w:i/>
+          <w:iCs/>
+        </w:rPr>
+        <w:t xml:space="preserve">update-server.sh</w:t>
+      </w:r>
+      <w:r>
+        <w:t xml:space="preserve"> </w:t>
+      </w:r>
+      <w:r>
+        <w:t xml:space="preserve">does not update), 5 minutes after the virtual machine starts, and every day at 23:00 UTC (6:00 p.m. in Colombia) if it is on.</w:t>
+      </w:r>
+    </w:p>
+    <w:p>
+      <w:pPr>
+        <w:pStyle w:val="Compact"/>
+        <w:numPr>
+          <w:ilvl w:val="0"/>
+          <w:numId w:val="1045"/>
+        </w:numPr>
+      </w:pPr>
+      <w:r>
+        <w:t xml:space="preserve">After each scheduled backup,</w:t>
+      </w:r>
+      <w:r>
+        <w:t xml:space="preserve"> </w:t>
+      </w:r>
+      <w:r>
+        <w:rPr>
+          <w:i/>
+          <w:iCs/>
+        </w:rPr>
+        <w:t xml:space="preserve">deploy/verify-backup.sh</w:t>
+      </w:r>
+      <w:r>
+        <w:t xml:space="preserve"> </w:t>
+      </w:r>
+      <w:r>
+        <w:t xml:space="preserve">restores it under another name, checks that it has the tables of the real database, and drops it. This way the restoration test of section 14.2 is done every day, without touching the real database.</w:t>
+      </w:r>
+    </w:p>
+    <w:p>
+      <w:pPr>
+        <w:pStyle w:val="Compact"/>
+        <w:numPr>
+          <w:ilvl w:val="0"/>
+          <w:numId w:val="1045"/>
+        </w:numPr>
+      </w:pPr>
+      <w:r>
+        <w:t xml:space="preserve">Every backup, check, and restore is written to</w:t>
+      </w:r>
+      <w:r>
+        <w:t xml:space="preserve"> </w:t>
+      </w:r>
+      <w:r>
+        <w:rPr>
+          <w:i/>
+          <w:iCs/>
+        </w:rPr>
+        <w:t xml:space="preserve">~/lavarapido/backups/backup.log</w:t>
+      </w:r>
+      <w:r>
+        <w:t xml:space="preserve">:</w:t>
+      </w:r>
+      <w:r>
+        <w:t xml:space="preserve"> </w:t>
+      </w:r>
+      <w:r>
+        <w:rPr>
+          <w:i/>
+          <w:iCs/>
+        </w:rPr>
+        <w:t xml:space="preserve">tail -20</w:t>
+      </w:r>
+      <w:r>
+        <w:t xml:space="preserve"> </w:t>
+      </w:r>
+      <w:r>
+        <w:t xml:space="preserve">shows the latest and</w:t>
+      </w:r>
+      <w:r>
+        <w:t xml:space="preserve"> </w:t>
+      </w:r>
+      <w:r>
+        <w:rPr>
+          <w:i/>
+          <w:iCs/>
+        </w:rPr>
+        <w:t xml:space="preserve">grep FALLÓ</w:t>
+      </w:r>
+      <w:r>
+        <w:t xml:space="preserve"> </w:t>
+      </w:r>
+      <w:r>
+        <w:t xml:space="preserve">only the problems.</w:t>
+      </w:r>
+    </w:p>
+    <w:p>
+      <w:pPr>
+        <w:pStyle w:val="Compact"/>
+        <w:numPr>
+          <w:ilvl w:val="0"/>
+          <w:numId w:val="1045"/>
+        </w:numPr>
+      </w:pPr>
+      <w:r>
+        <w:t xml:space="preserve">The database uses the SIMPLE recovery model: with full backups no transaction log backups are needed, and the log does not grow without limit.</w:t>
+      </w:r>
+    </w:p>
+    <w:p>
+      <w:pPr>
+        <w:pStyle w:val="Compact"/>
+        <w:numPr>
+          <w:ilvl w:val="0"/>
+          <w:numId w:val="1045"/>
+        </w:numPr>
+      </w:pPr>
+      <w:r>
+        <w:t xml:space="preserve">The backups live on the same disk as the virtual machine: they protect against an error or a bad migration, not against losing the machine. To meet the 3-2-1 rule of Table 13, copy them to the IT administrator's computer with</w:t>
+      </w:r>
+      <w:r>
+        <w:t xml:space="preserve"> </w:t>
+      </w:r>
+      <w:r>
+        <w:rPr>
+          <w:i/>
+          <w:iCs/>
+        </w:rPr>
+        <w:t xml:space="preserve">scp</w:t>
+      </w:r>
+      <w:r>
+        <w:t xml:space="preserve"> </w:t>
+      </w:r>
+      <w:r>
+        <w:t xml:space="preserve">or take a disk snapshot in Azure.</w:t>
+      </w:r>
+    </w:p>
     <w:bookmarkEnd w:id="114"/>
-    <w:bookmarkStart w:id="122" w:name="Xb68cbce4dac89095dab1711d60b2f777f6e4cd6"/>
+    <w:bookmarkEnd w:id="115"/>
+    <w:bookmarkStart w:id="123" w:name="Xb68cbce4dac89095dab1711d60b2f777f6e4cd6"/>
     <w:p>
       <w:pPr>
         <w:pStyle w:val="Heading2"/>
@@ -16157,7 +17274,7 @@
         <w:t xml:space="preserve">Restoring overwrites the current data with those of the backup: everything recorded after it is lost. For that reason, restoration must be an authorized and recorded decision, never an improvised reaction.</w:t>
       </w:r>
     </w:p>
-    <w:bookmarkStart w:id="115" w:name="X17a82d4dc7f630d9f1e1f8eceb7ba20b0d1a78b"/>
+    <w:bookmarkStart w:id="116" w:name="X17a82d4dc7f630d9f1e1f8eceb7ba20b0d1a78b"/>
     <w:p>
       <w:pPr>
         <w:pStyle w:val="Heading3"/>
@@ -16348,8 +17465,8 @@
         </w:tc>
       </w:tr>
     </w:tbl>
-    <w:bookmarkEnd w:id="115"/>
-    <w:bookmarkStart w:id="116" w:name="Xce004971e6f2d7e3aa603b677d27fbf4986b15d"/>
+    <w:bookmarkEnd w:id="116"/>
+    <w:bookmarkStart w:id="117" w:name="Xce004971e6f2d7e3aa603b677d27fbf4986b15d"/>
     <w:p>
       <w:pPr>
         <w:pStyle w:val="Heading3"/>
@@ -16363,7 +17480,7 @@
         <w:pStyle w:val="Compact"/>
         <w:numPr>
           <w:ilvl w:val="0"/>
-          <w:numId w:val="1043"/>
+          <w:numId w:val="1046"/>
         </w:numPr>
       </w:pPr>
       <w:r>
@@ -16375,7 +17492,7 @@
         <w:pStyle w:val="Compact"/>
         <w:numPr>
           <w:ilvl w:val="0"/>
-          <w:numId w:val="1043"/>
+          <w:numId w:val="1046"/>
         </w:numPr>
       </w:pPr>
       <w:r>
@@ -16387,7 +17504,7 @@
         <w:pStyle w:val="Compact"/>
         <w:numPr>
           <w:ilvl w:val="0"/>
-          <w:numId w:val="1043"/>
+          <w:numId w:val="1046"/>
         </w:numPr>
       </w:pPr>
       <w:r>
@@ -16399,7 +17516,7 @@
         <w:pStyle w:val="Compact"/>
         <w:numPr>
           <w:ilvl w:val="0"/>
-          <w:numId w:val="1043"/>
+          <w:numId w:val="1046"/>
         </w:numPr>
       </w:pPr>
       <w:r>
@@ -16411,7 +17528,7 @@
         <w:pStyle w:val="Compact"/>
         <w:numPr>
           <w:ilvl w:val="0"/>
-          <w:numId w:val="1043"/>
+          <w:numId w:val="1046"/>
         </w:numPr>
       </w:pPr>
       <w:r>
@@ -16423,7 +17540,7 @@
         <w:pStyle w:val="Compact"/>
         <w:numPr>
           <w:ilvl w:val="0"/>
-          <w:numId w:val="1043"/>
+          <w:numId w:val="1046"/>
         </w:numPr>
       </w:pPr>
       <w:r>
@@ -16435,7 +17552,7 @@
         <w:pStyle w:val="Compact"/>
         <w:numPr>
           <w:ilvl w:val="0"/>
-          <w:numId w:val="1043"/>
+          <w:numId w:val="1046"/>
         </w:numPr>
       </w:pPr>
       <w:r>
@@ -16447,7 +17564,7 @@
         <w:pStyle w:val="Compact"/>
         <w:numPr>
           <w:ilvl w:val="0"/>
-          <w:numId w:val="1043"/>
+          <w:numId w:val="1046"/>
         </w:numPr>
       </w:pPr>
       <w:r>
@@ -16743,7 +17860,7 @@
         <w:pStyle w:val="FirstParagraph"/>
       </w:pPr>
       <w:r>
-        <w:t xml:space="preserve">The</w:t>
+        <w:t xml:space="preserve">On the public server,</w:t>
       </w:r>
       <w:r>
         <w:t xml:space="preserve"> </w:t>
@@ -16753,6 +17870,60 @@
           <w:i/>
           <w:iCs/>
         </w:rPr>
+        <w:t xml:space="preserve">bash ~/lavarapido/lavarapido-infra/deploy/restore-db.sh</w:t>
+      </w:r>
+      <w:r>
+        <w:rPr>
+          <w:i/>
+          <w:iCs/>
+        </w:rPr>
+        <w:t xml:space="preserve"> </w:t>
+      </w:r>
+      <w:r>
+        <w:rPr>
+          <w:rStyle w:val="VerbatimChar"/>
+          <w:i/>
+          <w:iCs/>
+        </w:rPr>
+        <w:t xml:space="preserve">&lt;FILE&gt;</w:t>
+      </w:r>
+      <w:r>
+        <w:rPr>
+          <w:i/>
+          <w:iCs/>
+        </w:rPr>
+        <w:t xml:space="preserve">.bak.gz</w:t>
+      </w:r>
+      <w:r>
+        <w:t xml:space="preserve"> </w:t>
+      </w:r>
+      <w:r>
+        <w:t xml:space="preserve">is used: it asks to type RESTAURAR, first backs up the current database, stops the seven services, restores, and starts them again (2 to 3 minutes of downtime). With</w:t>
+      </w:r>
+      <w:r>
+        <w:t xml:space="preserve"> </w:t>
+      </w:r>
+      <w:r>
+        <w:rPr>
+          <w:i/>
+          <w:iCs/>
+        </w:rPr>
+        <w:t xml:space="preserve">--as LavaRapido_prueba</w:t>
+      </w:r>
+      <w:r>
+        <w:t xml:space="preserve"> </w:t>
+      </w:r>
+      <w:r>
+        <w:t xml:space="preserve">it restores under another name, without touching the real database, to inspect a backup. The</w:t>
+      </w:r>
+      <w:r>
+        <w:t xml:space="preserve"> </w:t>
+      </w:r>
+      <w:r>
+        <w:rPr>
+          <w:i/>
+          <w:iCs/>
+        </w:rPr>
         <w:t xml:space="preserve">WITH REPLACE</w:t>
       </w:r>
       <w:r>
@@ -16762,8 +17933,8 @@
         <w:t xml:space="preserve">option overwrites the existing database: use it only when you are sure of the chosen backup. If the command fails halfway, the database may remain in a restoring state or in single-user mode; do not restart the container without reviewing the SQL Server log.</w:t>
       </w:r>
     </w:p>
-    <w:bookmarkEnd w:id="116"/>
-    <w:bookmarkStart w:id="117" w:name="Xf4cd22f4b64de9ac2d122220c9b382312bd8977"/>
+    <w:bookmarkEnd w:id="117"/>
+    <w:bookmarkStart w:id="118" w:name="Xf4cd22f4b64de9ac2d122220c9b382312bd8977"/>
     <w:p>
       <w:pPr>
         <w:pStyle w:val="Heading3"/>
@@ -16777,7 +17948,7 @@
         <w:pStyle w:val="Compact"/>
         <w:numPr>
           <w:ilvl w:val="0"/>
-          <w:numId w:val="1044"/>
+          <w:numId w:val="1047"/>
         </w:numPr>
       </w:pPr>
       <w:r>
@@ -16789,7 +17960,7 @@
         <w:pStyle w:val="Compact"/>
         <w:numPr>
           <w:ilvl w:val="0"/>
-          <w:numId w:val="1044"/>
+          <w:numId w:val="1047"/>
         </w:numPr>
       </w:pPr>
       <w:r>
@@ -16833,7 +18004,7 @@
         <w:pStyle w:val="Compact"/>
         <w:numPr>
           <w:ilvl w:val="0"/>
-          <w:numId w:val="1044"/>
+          <w:numId w:val="1047"/>
         </w:numPr>
       </w:pPr>
       <w:r>
@@ -16845,7 +18016,7 @@
         <w:pStyle w:val="Compact"/>
         <w:numPr>
           <w:ilvl w:val="0"/>
-          <w:numId w:val="1044"/>
+          <w:numId w:val="1047"/>
         </w:numPr>
       </w:pPr>
       <w:r>
@@ -16857,7 +18028,7 @@
         <w:pStyle w:val="Compact"/>
         <w:numPr>
           <w:ilvl w:val="0"/>
-          <w:numId w:val="1044"/>
+          <w:numId w:val="1047"/>
         </w:numPr>
       </w:pPr>
       <w:r>
@@ -16888,8 +18059,8 @@
         <w:t xml:space="preserve">Payments transferred to the business's account and not recorded because of the restoration must be compared with the bank statement and recovered with the customers.</w:t>
       </w:r>
     </w:p>
-    <w:bookmarkEnd w:id="117"/>
-    <w:bookmarkStart w:id="121" w:name="X6e345c4be50066233814b07b7d589fb17e76409"/>
+    <w:bookmarkEnd w:id="118"/>
+    <w:bookmarkStart w:id="122" w:name="X6e345c4be50066233814b07b7d589fb17e76409"/>
     <w:p>
       <w:pPr>
         <w:pStyle w:val="Heading3"/>
@@ -16939,18 +18110,18 @@
           <wp:inline>
             <wp:extent cx="5334000" cy="3915734"/>
             <wp:effectExtent b="0" l="0" r="0" t="0"/>
-            <wp:docPr descr="Post-Restoration Verification" title="" id="119" name="Picture"/>
+            <wp:docPr descr="Post-Restoration Verification" title="" id="120" name="Picture"/>
             <a:graphic>
               <a:graphicData uri="http://schemas.openxmlformats.org/drawingml/2006/picture">
                 <pic:pic>
                   <pic:nvPicPr>
-                    <pic:cNvPr descr="capturas/administrator-13-post-restoration-verification.png" id="120" name="Picture"/>
+                    <pic:cNvPr descr="capturas/administrator-13-post-restoration-verification.png" id="121" name="Picture"/>
                     <pic:cNvPicPr>
                       <a:picLocks noChangeArrowheads="1" noChangeAspect="1"/>
                     </pic:cNvPicPr>
                   </pic:nvPicPr>
                   <pic:blipFill>
-                    <a:blip r:embed="rId118"/>
+                    <a:blip r:embed="rId119"/>
                     <a:stretch>
                       <a:fillRect/>
                     </a:stretch>
@@ -16977,9 +18148,9 @@
         </w:drawing>
       </w:r>
     </w:p>
-    <w:bookmarkEnd w:id="121"/>
     <w:bookmarkEnd w:id="122"/>
-    <w:bookmarkStart w:id="129" w:name="Xcc34154a85e55710fba9ea38c384f8441be9912"/>
+    <w:bookmarkEnd w:id="123"/>
+    <w:bookmarkStart w:id="130" w:name="Xcc34154a85e55710fba9ea38c384f8441be9912"/>
     <w:p>
       <w:pPr>
         <w:pStyle w:val="Heading2"/>
@@ -16988,7 +18159,7 @@
         <w:t xml:space="preserve">16. Auditing and Action History</w:t>
       </w:r>
     </w:p>
-    <w:bookmarkStart w:id="123" w:name="Xa4acf5af7d924896edbbdec668ce19891e0473e"/>
+    <w:bookmarkStart w:id="124" w:name="Xa4acf5af7d924896edbbdec668ce19891e0473e"/>
     <w:p>
       <w:pPr>
         <w:pStyle w:val="Heading3"/>
@@ -17473,8 +18644,8 @@
         <w:t xml:space="preserve">Prepared by the authors from the changelogs of the services. Logs must never contain passwords, tokens, or receipt content (Kent &amp; Souppaya, 2006).</w:t>
       </w:r>
     </w:p>
-    <w:bookmarkEnd w:id="123"/>
-    <w:bookmarkStart w:id="124" w:name="X2c28e09a8ed493d53f1d959aed5b3cbecb05046"/>
+    <w:bookmarkEnd w:id="124"/>
+    <w:bookmarkStart w:id="125" w:name="X2c28e09a8ed493d53f1d959aed5b3cbecb05046"/>
     <w:p>
       <w:pPr>
         <w:pStyle w:val="Heading3"/>
@@ -17999,8 +19170,8 @@
         <w:t xml:space="preserve">, SYSUTCDATETIME());</w:t>
       </w:r>
     </w:p>
-    <w:bookmarkEnd w:id="124"/>
-    <w:bookmarkStart w:id="128" w:name="X4a8b13398bc24f01ef10cac7002c8d0b8139008"/>
+    <w:bookmarkEnd w:id="125"/>
+    <w:bookmarkStart w:id="129" w:name="X4a8b13398bc24f01ef10cac7002c8d0b8139008"/>
     <w:p>
       <w:pPr>
         <w:pStyle w:val="Heading3"/>
@@ -18014,7 +19185,7 @@
         <w:pStyle w:val="Compact"/>
         <w:numPr>
           <w:ilvl w:val="0"/>
-          <w:numId w:val="1045"/>
+          <w:numId w:val="1048"/>
         </w:numPr>
       </w:pPr>
       <w:r>
@@ -18026,7 +19197,7 @@
         <w:pStyle w:val="Compact"/>
         <w:numPr>
           <w:ilvl w:val="0"/>
-          <w:numId w:val="1045"/>
+          <w:numId w:val="1048"/>
         </w:numPr>
       </w:pPr>
       <w:r>
@@ -18038,7 +19209,7 @@
         <w:pStyle w:val="Compact"/>
         <w:numPr>
           <w:ilvl w:val="0"/>
-          <w:numId w:val="1045"/>
+          <w:numId w:val="1048"/>
         </w:numPr>
       </w:pPr>
       <w:r>
@@ -18050,7 +19221,7 @@
         <w:pStyle w:val="Compact"/>
         <w:numPr>
           <w:ilvl w:val="0"/>
-          <w:numId w:val="1045"/>
+          <w:numId w:val="1048"/>
         </w:numPr>
       </w:pPr>
       <w:r>
@@ -18103,18 +19274,18 @@
           <wp:inline>
             <wp:extent cx="5334000" cy="1972339"/>
             <wp:effectExtent b="0" l="0" r="0" t="0"/>
-            <wp:docPr descr="Session History Query" title="" id="126" name="Picture"/>
+            <wp:docPr descr="Session History Query" title="" id="127" name="Picture"/>
             <a:graphic>
               <a:graphicData uri="http://schemas.openxmlformats.org/drawingml/2006/picture">
                 <pic:pic>
                   <pic:nvPicPr>
-                    <pic:cNvPr descr="capturas/administrator-14-session-history-query.png" id="127" name="Picture"/>
+                    <pic:cNvPr descr="capturas/administrator-14-session-history-query.png" id="128" name="Picture"/>
                     <pic:cNvPicPr>
                       <a:picLocks noChangeArrowheads="1" noChangeAspect="1"/>
                     </pic:cNvPicPr>
                   </pic:nvPicPr>
                   <pic:blipFill>
-                    <a:blip r:embed="rId125"/>
+                    <a:blip r:embed="rId126"/>
                     <a:stretch>
                       <a:fillRect/>
                     </a:stretch>
@@ -18141,9 +19312,9 @@
         </w:drawing>
       </w:r>
     </w:p>
-    <w:bookmarkEnd w:id="128"/>
     <w:bookmarkEnd w:id="129"/>
-    <w:bookmarkStart w:id="138" w:name="X3a5843390ed261a7b224edfe9bc55c66f8d5b94"/>
+    <w:bookmarkEnd w:id="130"/>
+    <w:bookmarkStart w:id="139" w:name="X3a5843390ed261a7b224edfe9bc55c66f8d5b94"/>
     <w:p>
       <w:pPr>
         <w:pStyle w:val="Heading2"/>
@@ -18160,7 +19331,7 @@
         <w:t xml:space="preserve">The project's security policy is based on defense in depth, least privilege, secure defaults, security by design, and zero trust. The following recommendations are aligned with the NIST controls (Joint Task Force, 2020) and with the OWASP Top 10 (OWASP Foundation, 2021).</w:t>
       </w:r>
     </w:p>
-    <w:bookmarkStart w:id="130" w:name="X574e94dcb8260d5c3352556c3b9c8767fcb74c3"/>
+    <w:bookmarkStart w:id="131" w:name="X574e94dcb8260d5c3352556c3b9c8767fcb74c3"/>
     <w:p>
       <w:pPr>
         <w:pStyle w:val="Heading3"/>
@@ -18174,7 +19345,7 @@
         <w:pStyle w:val="Compact"/>
         <w:numPr>
           <w:ilvl w:val="0"/>
-          <w:numId w:val="1046"/>
+          <w:numId w:val="1049"/>
         </w:numPr>
       </w:pPr>
       <w:r>
@@ -18186,7 +19357,7 @@
         <w:pStyle w:val="Compact"/>
         <w:numPr>
           <w:ilvl w:val="0"/>
-          <w:numId w:val="1046"/>
+          <w:numId w:val="1049"/>
         </w:numPr>
       </w:pPr>
       <w:r>
@@ -18198,7 +19369,7 @@
         <w:pStyle w:val="Compact"/>
         <w:numPr>
           <w:ilvl w:val="0"/>
-          <w:numId w:val="1046"/>
+          <w:numId w:val="1049"/>
         </w:numPr>
       </w:pPr>
       <w:r>
@@ -18210,7 +19381,7 @@
         <w:pStyle w:val="Compact"/>
         <w:numPr>
           <w:ilvl w:val="0"/>
-          <w:numId w:val="1046"/>
+          <w:numId w:val="1049"/>
         </w:numPr>
       </w:pPr>
       <w:r>
@@ -18222,7 +19393,7 @@
         <w:pStyle w:val="Compact"/>
         <w:numPr>
           <w:ilvl w:val="0"/>
-          <w:numId w:val="1046"/>
+          <w:numId w:val="1049"/>
         </w:numPr>
       </w:pPr>
       <w:r>
@@ -18234,15 +19405,15 @@
         <w:pStyle w:val="Compact"/>
         <w:numPr>
           <w:ilvl w:val="0"/>
-          <w:numId w:val="1046"/>
+          <w:numId w:val="1049"/>
         </w:numPr>
       </w:pPr>
       <w:r>
         <w:t xml:space="preserve">Log out when finished and do not log in from shared machines.</w:t>
       </w:r>
     </w:p>
-    <w:bookmarkEnd w:id="130"/>
-    <w:bookmarkStart w:id="131" w:name="X8ab437004a5552d5921f49679fee86f8fb165f3"/>
+    <w:bookmarkEnd w:id="131"/>
+    <w:bookmarkStart w:id="132" w:name="X8ab437004a5552d5921f49679fee86f8fb165f3"/>
     <w:p>
       <w:pPr>
         <w:pStyle w:val="Heading3"/>
@@ -18298,8 +19469,8 @@
         <w:t xml:space="preserve">), which serves as proof of consent. The administrator must consult only the data needed for the function, must not copy them to personal media, and must handle the requests of access or correction of the data subjects. No card data are collected. Backups and exports inherit the obligation of protection.</w:t>
       </w:r>
     </w:p>
-    <w:bookmarkEnd w:id="131"/>
-    <w:bookmarkStart w:id="132" w:name="Xa3fa6dfdd7cfc923a5683c6f03db157a0265f11"/>
+    <w:bookmarkEnd w:id="132"/>
+    <w:bookmarkStart w:id="133" w:name="Xa3fa6dfdd7cfc923a5683c6f03db157a0265f11"/>
     <w:p>
       <w:pPr>
         <w:pStyle w:val="Heading3"/>
@@ -18313,7 +19484,7 @@
         <w:pStyle w:val="Compact"/>
         <w:numPr>
           <w:ilvl w:val="0"/>
-          <w:numId w:val="1047"/>
+          <w:numId w:val="1050"/>
         </w:numPr>
       </w:pPr>
       <w:r>
@@ -18354,7 +19525,7 @@
         <w:pStyle w:val="Compact"/>
         <w:numPr>
           <w:ilvl w:val="0"/>
-          <w:numId w:val="1047"/>
+          <w:numId w:val="1050"/>
         </w:numPr>
       </w:pPr>
       <w:r>
@@ -18398,7 +19569,7 @@
         <w:pStyle w:val="Compact"/>
         <w:numPr>
           <w:ilvl w:val="0"/>
-          <w:numId w:val="1047"/>
+          <w:numId w:val="1050"/>
         </w:numPr>
       </w:pPr>
       <w:r>
@@ -18426,7 +19597,7 @@
         <w:pStyle w:val="Compact"/>
         <w:numPr>
           <w:ilvl w:val="0"/>
-          <w:numId w:val="1047"/>
+          <w:numId w:val="1050"/>
         </w:numPr>
       </w:pPr>
       <w:r>
@@ -18449,8 +19620,8 @@
         <w:t xml:space="preserve">profile must never reach a shared deployment.</w:t>
       </w:r>
     </w:p>
-    <w:bookmarkEnd w:id="132"/>
-    <w:bookmarkStart w:id="133" w:name="X4a0870b90fa6c4a0be6d0ee5b667e629e73ded0"/>
+    <w:bookmarkEnd w:id="133"/>
+    <w:bookmarkStart w:id="134" w:name="X4a0870b90fa6c4a0be6d0ee5b667e629e73ded0"/>
     <w:p>
       <w:pPr>
         <w:pStyle w:val="Heading3"/>
@@ -18464,7 +19635,7 @@
         <w:pStyle w:val="Compact"/>
         <w:numPr>
           <w:ilvl w:val="0"/>
-          <w:numId w:val="1048"/>
+          <w:numId w:val="1051"/>
         </w:numPr>
       </w:pPr>
       <w:r>
@@ -18476,11 +19647,37 @@
         <w:pStyle w:val="Compact"/>
         <w:numPr>
           <w:ilvl w:val="0"/>
-          <w:numId w:val="1048"/>
+          <w:numId w:val="1051"/>
         </w:numPr>
       </w:pPr>
       <w:r>
-        <w:t xml:space="preserve">Outside the local environment, use HTTPS with TLS 1.2 or higher.</w:t>
+        <w:t xml:space="preserve">Outside the local environment, use HTTPS with TLS 1.2 or higher. On the public server, Caddy also adds security headers and a content security policy (CSP) since October 20, 2026, and Docker checks the health of each container every 30 seconds (</w:t>
+      </w:r>
+      <w:r>
+        <w:rPr>
+          <w:i/>
+          <w:iCs/>
+        </w:rPr>
+        <w:t xml:space="preserve">docker compose ps</w:t>
+      </w:r>
+      <w:r>
+        <w:t xml:space="preserve"> </w:t>
+      </w:r>
+      <w:r>
+        <w:t xml:space="preserve">shows</w:t>
+      </w:r>
+      <w:r>
+        <w:t xml:space="preserve"> </w:t>
+      </w:r>
+      <w:r>
+        <w:rPr>
+          <w:i/>
+          <w:iCs/>
+        </w:rPr>
+        <w:t xml:space="preserve">healthy</w:t>
+      </w:r>
+      <w:r>
+        <w:t xml:space="preserve">).</w:t>
       </w:r>
     </w:p>
     <w:p>
@@ -18488,15 +19685,15 @@
         <w:pStyle w:val="Compact"/>
         <w:numPr>
           <w:ilvl w:val="0"/>
-          <w:numId w:val="1048"/>
+          <w:numId w:val="1051"/>
         </w:numPr>
       </w:pPr>
       <w:r>
         <w:t xml:space="preserve">The gateway does not apply a request rate limit. Account lockout stops someone trying to guess passwords, but on a server exposed to the internet a rate limit should also be added in the proxy (Caddy) or in the gateway.</w:t>
       </w:r>
     </w:p>
-    <w:bookmarkEnd w:id="133"/>
-    <w:bookmarkStart w:id="134" w:name="X46475ffb964a9fc3cb87b3d76db0442370fca8d"/>
+    <w:bookmarkEnd w:id="134"/>
+    <w:bookmarkStart w:id="135" w:name="X46475ffb964a9fc3cb87b3d76db0442370fca8d"/>
     <w:p>
       <w:pPr>
         <w:pStyle w:val="Heading3"/>
@@ -18574,18 +19771,18 @@
               <w:pStyle w:val="Compact"/>
             </w:pPr>
             <w:r>
-              <w:t xml:space="preserve">A token is not revoked before it expires (1 hour).</w:t>
-            </w:r>
-          </w:p>
-        </w:tc>
-        <w:tc>
-          <w:tcPr/>
-          <w:p>
-            <w:pPr>
-              <w:pStyle w:val="Compact"/>
-            </w:pPr>
-            <w:r>
-              <w:t xml:space="preserve">Deactivate the account and, if serious, rotate the JWT secret.</w:t>
+              <w:t xml:space="preserve">The token of a closed session still works for up to 30 seconds (or until it expires, if security-service does not answer).</w:t>
+            </w:r>
+          </w:p>
+        </w:tc>
+        <w:tc>
+          <w:tcPr/>
+          <w:p>
+            <w:pPr>
+              <w:pStyle w:val="Compact"/>
+            </w:pPr>
+            <w:r>
+              <w:t xml:space="preserve">Deactivate the account, which closes all its sessions, and, if serious, rotate the JWT secret.</w:t>
             </w:r>
           </w:p>
         </w:tc>
@@ -18777,8 +19974,8 @@
         <w:t xml:space="preserve">Prepared by the authors from ADR-004, ADR-006, ADR-008, and the technical backlog of the project.</w:t>
       </w:r>
     </w:p>
-    <w:bookmarkEnd w:id="134"/>
-    <w:bookmarkStart w:id="135" w:name="Xeda79ad1f1b17db7e8288ee121dc9294bbf3b78"/>
+    <w:bookmarkEnd w:id="135"/>
+    <w:bookmarkStart w:id="136" w:name="Xeda79ad1f1b17db7e8288ee121dc9294bbf3b78"/>
     <w:p>
       <w:pPr>
         <w:pStyle w:val="Heading3"/>
@@ -18898,7 +20095,20 @@
               <w:pStyle w:val="Compact"/>
             </w:pPr>
             <w:r>
-              <w:t xml:space="preserve">The file of the day and the backup log.</w:t>
+              <w:t xml:space="preserve">The file of the day and the backup log (on the public server,</w:t>
+            </w:r>
+            <w:r>
+              <w:t xml:space="preserve"> </w:t>
+            </w:r>
+            <w:r>
+              <w:rPr>
+                <w:i/>
+                <w:iCs/>
+              </w:rPr>
+              <w:t xml:space="preserve">tail -5 ~/lavarapido/backups/backup.log</w:t>
+            </w:r>
+            <w:r>
+              <w:t xml:space="preserve">).</w:t>
             </w:r>
           </w:p>
         </w:tc>
@@ -19140,7 +20350,23 @@
               <w:pStyle w:val="Compact"/>
             </w:pPr>
             <w:r>
-              <w:t xml:space="preserve">Verification of section 15.3.</w:t>
+              <w:t xml:space="preserve">Verification of section 15.3 (on the public server,</w:t>
+            </w:r>
+            <w:r>
+              <w:t xml:space="preserve"> </w:t>
+            </w:r>
+            <w:r>
+              <w:rPr>
+                <w:i/>
+                <w:iCs/>
+              </w:rPr>
+              <w:t xml:space="preserve">verify-backup.sh</w:t>
+            </w:r>
+            <w:r>
+              <w:t xml:space="preserve"> </w:t>
+            </w:r>
+            <w:r>
+              <w:t xml:space="preserve">does it every day).</w:t>
             </w:r>
           </w:p>
         </w:tc>
@@ -19538,8 +20764,8 @@
         <w:t xml:space="preserve">"DBCC CHECKDB ([LavaRapido]) WITH NO_INFOMSGS"</w:t>
       </w:r>
     </w:p>
-    <w:bookmarkEnd w:id="135"/>
-    <w:bookmarkStart w:id="136" w:name="Xe2ac909301c23b06afcbc203db2b6330e815d34"/>
+    <w:bookmarkEnd w:id="136"/>
+    <w:bookmarkStart w:id="137" w:name="Xe2ac909301c23b06afcbc203db2b6330e815d34"/>
     <w:p>
       <w:pPr>
         <w:pStyle w:val="Heading3"/>
@@ -19937,6 +21163,41 @@
               <w:pStyle w:val="Compact"/>
             </w:pPr>
             <w:r>
+              <w:t xml:space="preserve">Bookings in To close</w:t>
+            </w:r>
+          </w:p>
+        </w:tc>
+        <w:tc>
+          <w:tcPr/>
+          <w:p>
+            <w:pPr>
+              <w:pStyle w:val="Compact"/>
+            </w:pPr>
+            <w:r>
+              <w:t xml:space="preserve">The operator served the vehicle but did not press Start or Finish, or the customer did not come.</w:t>
+            </w:r>
+          </w:p>
+        </w:tc>
+        <w:tc>
+          <w:tcPr/>
+          <w:p>
+            <w:pPr>
+              <w:pStyle w:val="Compact"/>
+            </w:pPr>
+            <w:r>
+              <w:t xml:space="preserve">Ask the operator and close with Attended or No-show (section 12.3); remind the team to record every service.</w:t>
+            </w:r>
+          </w:p>
+        </w:tc>
+      </w:tr>
+      <w:tr>
+        <w:tc>
+          <w:tcPr/>
+          <w:p>
+            <w:pPr>
+              <w:pStyle w:val="Compact"/>
+            </w:pPr>
+            <w:r>
               <w:t xml:space="preserve">Payments fail through the gateway in Docker</w:t>
             </w:r>
           </w:p>
@@ -20359,8 +21620,8 @@
         <w:t xml:space="preserve">Installation problems are detailed in the Installation Manual, section 17.</w:t>
       </w:r>
     </w:p>
-    <w:bookmarkEnd w:id="136"/>
-    <w:bookmarkStart w:id="137" w:name="Xfadc322e054df5ba86f0b82d8fc44eb8d804050"/>
+    <w:bookmarkEnd w:id="137"/>
+    <w:bookmarkStart w:id="138" w:name="Xfadc322e054df5ba86f0b82d8fc44eb8d804050"/>
     <w:p>
       <w:pPr>
         <w:pStyle w:val="Heading3"/>
@@ -20609,9 +21870,9 @@
         <w:t xml:space="preserve">Every incident must be recorded with the date, who detected it, the description, the severity, the cause, the actions, the result, and the measures to prevent its recurrence (Annex C).</w:t>
       </w:r>
     </w:p>
-    <w:bookmarkEnd w:id="137"/>
     <w:bookmarkEnd w:id="138"/>
-    <w:bookmarkStart w:id="139" w:name="X6cb5874b4dca1f069fcc4e14c2e778616fd467e"/>
+    <w:bookmarkEnd w:id="139"/>
+    <w:bookmarkStart w:id="140" w:name="X6cb5874b4dca1f069fcc4e14c2e778616fd467e"/>
     <w:p>
       <w:pPr>
         <w:pStyle w:val="Heading2"/>
@@ -21113,6 +22374,30 @@
           </w:p>
         </w:tc>
       </w:tr>
+      <w:tr>
+        <w:tc>
+          <w:tcPr/>
+          <w:p>
+            <w:pPr>
+              <w:pStyle w:val="Compact"/>
+            </w:pPr>
+            <w:r>
+              <w:t xml:space="preserve">To close</w:t>
+            </w:r>
+          </w:p>
+        </w:tc>
+        <w:tc>
+          <w:tcPr/>
+          <w:p>
+            <w:pPr>
+              <w:pStyle w:val="Compact"/>
+            </w:pPr>
+            <w:r>
+              <w:t xml:space="preserve">Home screen card with the bookings with an operator that ended without being recorded; the administrator closes them with Attended or No-show.</w:t>
+            </w:r>
+          </w:p>
+        </w:tc>
+      </w:tr>
     </w:tbl>
     <w:p>
       <w:pPr>
@@ -21132,8 +22417,8 @@
         <w:t xml:space="preserve">Prepared by the authors from the project documentation.</w:t>
       </w:r>
     </w:p>
-    <w:bookmarkEnd w:id="139"/>
-    <w:bookmarkStart w:id="150" w:name="references"/>
+    <w:bookmarkEnd w:id="140"/>
+    <w:bookmarkStart w:id="151" w:name="references"/>
     <w:p>
       <w:pPr>
         <w:pStyle w:val="Heading2"/>
@@ -21168,7 +22453,7 @@
       <w:r>
         <w:t xml:space="preserve"> </w:t>
       </w:r>
-      <w:hyperlink r:id="rId140">
+      <w:hyperlink r:id="rId141">
         <w:r>
           <w:rPr>
             <w:rStyle w:val="Hyperlink"/>
@@ -21203,7 +22488,7 @@
       <w:r>
         <w:t xml:space="preserve"> </w:t>
       </w:r>
-      <w:hyperlink r:id="rId141">
+      <w:hyperlink r:id="rId142">
         <w:r>
           <w:rPr>
             <w:rStyle w:val="Hyperlink"/>
@@ -21238,7 +22523,7 @@
       <w:r>
         <w:t xml:space="preserve"> </w:t>
       </w:r>
-      <w:hyperlink r:id="rId142">
+      <w:hyperlink r:id="rId143">
         <w:r>
           <w:rPr>
             <w:rStyle w:val="Hyperlink"/>
@@ -21270,7 +22555,7 @@
       <w:r>
         <w:t xml:space="preserve"> </w:t>
       </w:r>
-      <w:hyperlink r:id="rId143">
+      <w:hyperlink r:id="rId144">
         <w:r>
           <w:rPr>
             <w:rStyle w:val="Hyperlink"/>
@@ -21302,7 +22587,7 @@
       <w:r>
         <w:t xml:space="preserve"> </w:t>
       </w:r>
-      <w:hyperlink r:id="rId144">
+      <w:hyperlink r:id="rId145">
         <w:r>
           <w:rPr>
             <w:rStyle w:val="Hyperlink"/>
@@ -21361,7 +22646,7 @@
       <w:r>
         <w:t xml:space="preserve"> </w:t>
       </w:r>
-      <w:hyperlink r:id="rId145">
+      <w:hyperlink r:id="rId146">
         <w:r>
           <w:rPr>
             <w:rStyle w:val="Hyperlink"/>
@@ -21396,7 +22681,7 @@
       <w:r>
         <w:t xml:space="preserve"> </w:t>
       </w:r>
-      <w:hyperlink r:id="rId146">
+      <w:hyperlink r:id="rId147">
         <w:r>
           <w:rPr>
             <w:rStyle w:val="Hyperlink"/>
@@ -21431,7 +22716,7 @@
       <w:r>
         <w:t xml:space="preserve"> </w:t>
       </w:r>
-      <w:hyperlink r:id="rId147">
+      <w:hyperlink r:id="rId148">
         <w:r>
           <w:rPr>
             <w:rStyle w:val="Hyperlink"/>
@@ -21466,7 +22751,7 @@
       <w:r>
         <w:t xml:space="preserve"> </w:t>
       </w:r>
-      <w:hyperlink r:id="rId148">
+      <w:hyperlink r:id="rId149">
         <w:r>
           <w:rPr>
             <w:rStyle w:val="Hyperlink"/>
@@ -21501,7 +22786,7 @@
       <w:r>
         <w:t xml:space="preserve"> </w:t>
       </w:r>
-      <w:hyperlink r:id="rId149">
+      <w:hyperlink r:id="rId150">
         <w:r>
           <w:rPr>
             <w:rStyle w:val="Hyperlink"/>
@@ -21510,8 +22795,8 @@
         </w:r>
       </w:hyperlink>
     </w:p>
-    <w:bookmarkEnd w:id="150"/>
-    <w:bookmarkStart w:id="155" w:name="X3ebececf266e1d58a5da7182dd2ea53c277ac9c"/>
+    <w:bookmarkEnd w:id="151"/>
+    <w:bookmarkStart w:id="156" w:name="X3ebececf266e1d58a5da7182dd2ea53c277ac9c"/>
     <w:p>
       <w:pPr>
         <w:pStyle w:val="Heading2"/>
@@ -21520,7 +22805,7 @@
         <w:t xml:space="preserve">19. Annexes</w:t>
       </w:r>
     </w:p>
-    <w:bookmarkStart w:id="151" w:name="annex-a-source-of-the-screenshots"/>
+    <w:bookmarkStart w:id="152" w:name="annex-a-source-of-the-screenshots"/>
     <w:p>
       <w:pPr>
         <w:pStyle w:val="Heading3"/>
@@ -21582,8 +22867,8 @@
         <w:t xml:space="preserve">folder.</w:t>
       </w:r>
     </w:p>
-    <w:bookmarkEnd w:id="151"/>
-    <w:bookmarkStart w:id="152" w:name="X719a53e5da98359ae1512a7bf320875fef9c36a"/>
+    <w:bookmarkEnd w:id="152"/>
+    <w:bookmarkStart w:id="153" w:name="X719a53e5da98359ae1512a7bf320875fef9c36a"/>
     <w:p>
       <w:pPr>
         <w:pStyle w:val="Heading3"/>
@@ -21754,7 +23039,7 @@
               <w:pStyle w:val="Compact"/>
             </w:pPr>
             <w:r>
-              <w:t xml:space="preserve">Not defined; the proposed values must be approved.</w:t>
+              <w:t xml:space="preserve">On the public server backups are automatic and checked every day (section 14.6); the RPO and RTO objectives and a copy outside the virtual machine still need approval.</w:t>
             </w:r>
           </w:p>
         </w:tc>
@@ -21894,8 +23179,8 @@
         <w:t xml:space="preserve">Prepared by the authors from the verification of the source code and the technical backlog of the project.</w:t>
       </w:r>
     </w:p>
-    <w:bookmarkEnd w:id="152"/>
-    <w:bookmarkStart w:id="153" w:name="annex-c-incident-record-template"/>
+    <w:bookmarkEnd w:id="153"/>
+    <w:bookmarkStart w:id="154" w:name="annex-c-incident-record-template"/>
     <w:p>
       <w:pPr>
         <w:pStyle w:val="Heading3"/>
@@ -22179,8 +23464,8 @@
         </w:tc>
       </w:tr>
     </w:tbl>
-    <w:bookmarkEnd w:id="153"/>
-    <w:bookmarkStart w:id="154" w:name="annex-d-delivery-checklist"/>
+    <w:bookmarkEnd w:id="154"/>
+    <w:bookmarkStart w:id="155" w:name="annex-d-delivery-checklist"/>
     <w:p>
       <w:pPr>
         <w:pStyle w:val="Heading3"/>
@@ -22485,9 +23770,9 @@
         <w:t xml:space="preserve">Adapted from the checklist of the guide for writing software manuals (SENA, 2026).</w:t>
       </w:r>
     </w:p>
-    <w:bookmarkEnd w:id="154"/>
     <w:bookmarkEnd w:id="155"/>
     <w:bookmarkEnd w:id="156"/>
+    <w:bookmarkEnd w:id="157"/>
     <w:sectPr>
       <w:footnotePr>
         <w:numRestart w:val="eachSect"/>
@@ -23216,34 +24501,7 @@
     </w:lvlOverride>
   </w:num>
   <w:num w:numId="1035">
-    <w:abstractNumId w:val="99411"/>
-    <w:lvlOverride w:ilvl="0">
-      <w:startOverride w:val="1"/>
-    </w:lvlOverride>
-    <w:lvlOverride w:ilvl="1">
-      <w:startOverride w:val="1"/>
-    </w:lvlOverride>
-    <w:lvlOverride w:ilvl="2">
-      <w:startOverride w:val="1"/>
-    </w:lvlOverride>
-    <w:lvlOverride w:ilvl="3">
-      <w:startOverride w:val="1"/>
-    </w:lvlOverride>
-    <w:lvlOverride w:ilvl="4">
-      <w:startOverride w:val="1"/>
-    </w:lvlOverride>
-    <w:lvlOverride w:ilvl="5">
-      <w:startOverride w:val="1"/>
-    </w:lvlOverride>
-    <w:lvlOverride w:ilvl="6">
-      <w:startOverride w:val="1"/>
-    </w:lvlOverride>
-    <w:lvlOverride w:ilvl="7">
-      <w:startOverride w:val="1"/>
-    </w:lvlOverride>
-    <w:lvlOverride w:ilvl="8">
-      <w:startOverride w:val="1"/>
-    </w:lvlOverride>
+    <w:abstractNumId w:val="991"/>
   </w:num>
   <w:num w:numId="1036">
     <w:abstractNumId w:val="99411"/>
@@ -23426,7 +24684,34 @@
     </w:lvlOverride>
   </w:num>
   <w:num w:numId="1042">
-    <w:abstractNumId w:val="991"/>
+    <w:abstractNumId w:val="99411"/>
+    <w:lvlOverride w:ilvl="0">
+      <w:startOverride w:val="1"/>
+    </w:lvlOverride>
+    <w:lvlOverride w:ilvl="1">
+      <w:startOverride w:val="1"/>
+    </w:lvlOverride>
+    <w:lvlOverride w:ilvl="2">
+      <w:startOverride w:val="1"/>
+    </w:lvlOverride>
+    <w:lvlOverride w:ilvl="3">
+      <w:startOverride w:val="1"/>
+    </w:lvlOverride>
+    <w:lvlOverride w:ilvl="4">
+      <w:startOverride w:val="1"/>
+    </w:lvlOverride>
+    <w:lvlOverride w:ilvl="5">
+      <w:startOverride w:val="1"/>
+    </w:lvlOverride>
+    <w:lvlOverride w:ilvl="6">
+      <w:startOverride w:val="1"/>
+    </w:lvlOverride>
+    <w:lvlOverride w:ilvl="7">
+      <w:startOverride w:val="1"/>
+    </w:lvlOverride>
+    <w:lvlOverride w:ilvl="8">
+      <w:startOverride w:val="1"/>
+    </w:lvlOverride>
   </w:num>
   <w:num w:numId="1043">
     <w:abstractNumId w:val="99411"/>
@@ -23465,12 +24750,48 @@
     <w:abstractNumId w:val="991"/>
   </w:num>
   <w:num w:numId="1046">
-    <w:abstractNumId w:val="991"/>
+    <w:abstractNumId w:val="99411"/>
+    <w:lvlOverride w:ilvl="0">
+      <w:startOverride w:val="1"/>
+    </w:lvlOverride>
+    <w:lvlOverride w:ilvl="1">
+      <w:startOverride w:val="1"/>
+    </w:lvlOverride>
+    <w:lvlOverride w:ilvl="2">
+      <w:startOverride w:val="1"/>
+    </w:lvlOverride>
+    <w:lvlOverride w:ilvl="3">
+      <w:startOverride w:val="1"/>
+    </w:lvlOverride>
+    <w:lvlOverride w:ilvl="4">
+      <w:startOverride w:val="1"/>
+    </w:lvlOverride>
+    <w:lvlOverride w:ilvl="5">
+      <w:startOverride w:val="1"/>
+    </w:lvlOverride>
+    <w:lvlOverride w:ilvl="6">
+      <w:startOverride w:val="1"/>
+    </w:lvlOverride>
+    <w:lvlOverride w:ilvl="7">
+      <w:startOverride w:val="1"/>
+    </w:lvlOverride>
+    <w:lvlOverride w:ilvl="8">
+      <w:startOverride w:val="1"/>
+    </w:lvlOverride>
   </w:num>
   <w:num w:numId="1047">
     <w:abstractNumId w:val="991"/>
   </w:num>
   <w:num w:numId="1048">
+    <w:abstractNumId w:val="991"/>
+  </w:num>
+  <w:num w:numId="1049">
+    <w:abstractNumId w:val="991"/>
+  </w:num>
+  <w:num w:numId="1050">
+    <w:abstractNumId w:val="991"/>
+  </w:num>
+  <w:num w:numId="1051">
     <w:abstractNumId w:val="991"/>
   </w:num>
 </w:numbering>

</xml_diff>

<commit_message>
docs(manuals): regenerate the PDF and Word of the six manuals
</commit_message>
<xml_diff>
--- a/09_MANUALES/EN/WORD/09_Administrator_Manual.docx
+++ b/09_MANUALES/EN/WORD/09_Administrator_Manual.docx
@@ -72,7 +72,7 @@
         <w:pStyle w:val="BodyText"/>
       </w:pPr>
       <w:r>
-        <w:t xml:space="preserve">Manual Type: Administrator Manual (Business Administrators and IT Administrators) · Version 4.10</w:t>
+        <w:t xml:space="preserve">Manual Type: Administrator Manual (Business Administrators and IT Administrators) · Version 4.11</w:t>
       </w:r>
     </w:p>
     <w:bookmarkStart w:id="9" w:name="version-control"/>
@@ -1176,6 +1176,52 @@
             </w:r>
             <w:r>
               <w:t xml:space="preserve">already published on October 26, 2026 (14.6).</w:t>
+            </w:r>
+          </w:p>
+        </w:tc>
+        <w:tc>
+          <w:tcPr/>
+          <w:p>
+            <w:pPr>
+              <w:pStyle w:val="Compact"/>
+            </w:pPr>
+            <w:r>
+              <w:t xml:space="preserve">Development team</w:t>
+            </w:r>
+          </w:p>
+        </w:tc>
+      </w:tr>
+      <w:tr>
+        <w:tc>
+          <w:tcPr/>
+          <w:p>
+            <w:pPr>
+              <w:pStyle w:val="Compact"/>
+            </w:pPr>
+            <w:r>
+              <w:t xml:space="preserve">4.11</w:t>
+            </w:r>
+          </w:p>
+        </w:tc>
+        <w:tc>
+          <w:tcPr/>
+          <w:p>
+            <w:pPr>
+              <w:pStyle w:val="Compact"/>
+            </w:pPr>
+            <w:r>
+              <w:t xml:space="preserve">2026-10-26</w:t>
+            </w:r>
+          </w:p>
+        </w:tc>
+        <w:tc>
+          <w:tcPr/>
+          <w:p>
+            <w:pPr>
+              <w:pStyle w:val="Compact"/>
+            </w:pPr>
+            <w:r>
+              <w:t xml:space="preserve">Continuous deployment is active since October 26, 2026 (14.6).</w:t>
             </w:r>
           </w:p>
         </w:tc>
@@ -18792,43 +18838,29 @@
           <w:b/>
           <w:bCs/>
         </w:rPr>
-        <w:t xml:space="preserve">Continuous deployment (merged into</w:t>
-      </w:r>
-      <w:r>
-        <w:rPr>
-          <w:b/>
-          <w:bCs/>
-        </w:rPr>
-        <w:t xml:space="preserve"> </w:t>
-      </w:r>
-      <w:r>
-        <w:rPr>
-          <w:b/>
-          <w:bCs/>
+        <w:t xml:space="preserve">Continuous deployment (active since October 26, 2026).</w:t>
+      </w:r>
+      <w:r>
+        <w:t xml:space="preserve"> </w:t>
+      </w:r>
+      <w:r>
+        <w:t xml:space="preserve">Every approved merge into</w:t>
+      </w:r>
+      <w:r>
+        <w:t xml:space="preserve"> </w:t>
+      </w:r>
+      <w:r>
+        <w:rPr>
           <w:i/>
           <w:iCs/>
         </w:rPr>
-        <w:t xml:space="preserve">develop</w:t>
-      </w:r>
-      <w:r>
-        <w:rPr>
-          <w:b/>
-          <w:bCs/>
-        </w:rPr>
-        <w:t xml:space="preserve"> </w:t>
-      </w:r>
-      <w:r>
-        <w:rPr>
-          <w:b/>
-          <w:bCs/>
-        </w:rPr>
-        <w:t xml:space="preserve">on October 24, 2026; the secrets are missing).</w:t>
-      </w:r>
-      <w:r>
-        <w:t xml:space="preserve"> </w:t>
-      </w:r>
-      <w:r>
-        <w:t xml:space="preserve">Since that day</w:t>
+        <w:t xml:space="preserve">main</w:t>
+      </w:r>
+      <w:r>
+        <w:t xml:space="preserve"> </w:t>
+      </w:r>
+      <w:r>
+        <w:t xml:space="preserve">deploys on its own (Deployment Document, sections 1.3.12 and 4.3.4). Since that day</w:t>
       </w:r>
       <w:r>
         <w:t xml:space="preserve"> </w:t>

</xml_diff>

<commit_message>
docs(manuals): regenerate the PDF and Word of the updated manuals
</commit_message>
<xml_diff>
--- a/09_MANUALES/EN/WORD/09_Administrator_Manual.docx
+++ b/09_MANUALES/EN/WORD/09_Administrator_Manual.docx
@@ -72,7 +72,7 @@
         <w:pStyle w:val="BodyText"/>
       </w:pPr>
       <w:r>
-        <w:t xml:space="preserve">Manual Type: Administrator Manual (Business Administrators and IT Administrators) · Version 4.11</w:t>
+        <w:t xml:space="preserve">Manual Type: Administrator Manual (Business Administrators and IT Administrators) · Version 4.12</w:t>
       </w:r>
     </w:p>
     <w:bookmarkStart w:id="9" w:name="version-control"/>
@@ -1222,6 +1222,52 @@
             </w:pPr>
             <w:r>
               <w:t xml:space="preserve">Continuous deployment is active since October 26, 2026 (14.6).</w:t>
+            </w:r>
+          </w:p>
+        </w:tc>
+        <w:tc>
+          <w:tcPr/>
+          <w:p>
+            <w:pPr>
+              <w:pStyle w:val="Compact"/>
+            </w:pPr>
+            <w:r>
+              <w:t xml:space="preserve">Development team</w:t>
+            </w:r>
+          </w:p>
+        </w:tc>
+      </w:tr>
+      <w:tr>
+        <w:tc>
+          <w:tcPr/>
+          <w:p>
+            <w:pPr>
+              <w:pStyle w:val="Compact"/>
+            </w:pPr>
+            <w:r>
+              <w:t xml:space="preserve">4.12</w:t>
+            </w:r>
+          </w:p>
+        </w:tc>
+        <w:tc>
+          <w:tcPr/>
+          <w:p>
+            <w:pPr>
+              <w:pStyle w:val="Compact"/>
+            </w:pPr>
+            <w:r>
+              <w:t xml:space="preserve">2026-10-27</w:t>
+            </w:r>
+          </w:p>
+        </w:tc>
+        <w:tc>
+          <w:tcPr/>
+          <w:p>
+            <w:pPr>
+              <w:pStyle w:val="Compact"/>
+            </w:pPr>
+            <w:r>
+              <w:t xml:space="preserve">At most 10 services per booking and alternatives that respect the other bookings of the vehicle (booking management).</w:t>
             </w:r>
           </w:p>
         </w:tc>
@@ -11704,6 +11750,18 @@
       </w:r>
       <w:r>
         <w:t xml:space="preserve">the customer can have at most one active cash booking; the slot comes back when that booking is completed, cancelled, or marked No-show (not when the administrator records the payment). The administrator records the payment when the customer pays (section 12.6).</w:t>
+      </w:r>
+    </w:p>
+    <w:p>
+      <w:pPr>
+        <w:pStyle w:val="Compact"/>
+        <w:numPr>
+          <w:ilvl w:val="0"/>
+          <w:numId w:val="1035"/>
+        </w:numPr>
+      </w:pPr>
+      <w:r>
+        <w:t xml:space="preserve">A booking accepts at most 10 services (since October 27, 2026). If the chosen time is no longer free, the alternative times the system offers do not include those that overlap another booking of the same vehicle.</w:t>
       </w:r>
     </w:p>
     <w:p>

</xml_diff>